<commit_message>
Lab 3: Part 1 setup
Co-Authored-By: Claude Sonnet 5.5 <noreply@anthropic.com>
Claude-Session: https://claude.ai/code/session_01AxRBWGkpGe1tM1Y5SaPo4g
</commit_message>
<xml_diff>
--- a/lab3/lab-3_report.docx
+++ b/lab3/lab-3_report.docx
@@ -282,11 +282,184 @@
       </w:r>
     </w:p>
     <w:p>
+      <w:r>
+        <w:rPr>
+          <w:rFonts w:ascii="Times New Roman" w:hAnsi="Times New Roman" w:eastAsia="Times New Roman"/>
+          <w:b/>
+          <w:sz w:val="24"/>
+        </w:rPr>
+        <w:t>Часть 1. Настройка инфраструктуры</w:t>
+      </w:r>
+    </w:p>
+    <w:p>
+      <w:r>
+        <w:rPr>
+          <w:rFonts w:ascii="Times New Roman" w:hAnsi="Times New Roman" w:eastAsia="Times New Roman"/>
+          <w:b w:val="0"/>
+          <w:sz w:val="22"/>
+        </w:rPr>
+        <w:t>1. Создал в VirtualBox сеть NAT (NatNetwork) с включённым DHCP. На исходной виртуальной машине Debian 11 убрал конфигурацию bonding из лабораторной работы 1, настроил получение адреса по DHCP через netplan и установил утилиты: bmon, nethogs, mtr, traceroute, vnstat, nc, tcpdump, lsof, iftop, nload, sshpass, dig.</w:t>
+      </w:r>
+    </w:p>
+    <w:p>
+      <w:r>
+        <w:rPr>
+          <w:rFonts w:ascii="Times New Roman" w:hAnsi="Times New Roman" w:eastAsia="Times New Roman"/>
+          <w:b w:val="0"/>
+          <w:sz w:val="22"/>
+        </w:rPr>
+        <w:t>2. Сделал две полные копии машины с новыми MAC-адресами и назвал их c7-1 и c7-2. На обеих сетевой адаптер переведён в режим «Сеть NAT» с неразборчивым режимом «Разрешить все», имена заданы командой hostnamectl set-hostname.</w:t>
+      </w:r>
+    </w:p>
+    <w:p>
+      <w:r>
+        <w:rPr>
+          <w:rFonts w:ascii="Times New Roman" w:hAnsi="Times New Roman" w:eastAsia="Times New Roman"/>
+          <w:b w:val="0"/>
+          <w:sz w:val="22"/>
+        </w:rPr>
+        <w:t>3. Сразу обе машины получили один адрес 10.0.2.3, так как клоны унаследовали одинаковый /etc/machine-id (на его основе DHCP-клиент формирует идентификатор). На c7-2 пересоздал идентификатор командой systemd-machine-id-setup и перезагрузил машину, после чего адреса стали разными.</w:t>
+      </w:r>
+    </w:p>
+    <w:p>
+      <w:r>
+        <w:rPr>
+          <w:rFonts w:ascii="Times New Roman" w:hAnsi="Times New Roman" w:eastAsia="Times New Roman"/>
+          <w:b w:val="0"/>
+          <w:sz w:val="22"/>
+        </w:rPr>
+        <w:t>4. Определил адреса: c7-1 — 10.0.2.16/24, c7-2 — 10.0.2.4/24. Проверил связь между машинами и доступность внешней сети с c7-1 командой ping. Wireshark установлен на реальном хосте.</w:t>
+      </w:r>
+    </w:p>
+    <w:p/>
+    <w:p>
       <w:pPr>
         <w:pStyle w:val="Heading1"/>
       </w:pPr>
       <w:r>
         <w:t>Артефакты выполнения</w:t>
+      </w:r>
+    </w:p>
+    <w:p>
+      <w:pPr>
+        <w:pStyle w:val="Heading2"/>
+      </w:pPr>
+      <w:r>
+        <w:t>Артефакт 0. Настройка стенда (Часть 1, п. 3, 5)</w:t>
+      </w:r>
+    </w:p>
+    <w:p>
+      <w:r>
+        <w:rPr>
+          <w:rFonts w:ascii="Times New Roman" w:hAnsi="Times New Roman" w:eastAsia="Times New Roman"/>
+          <w:b w:val="0"/>
+          <w:sz w:val="22"/>
+        </w:rPr>
+        <w:t>Адреса машин c7-1 (10.0.2.16) и c7-2 (10.0.2.4), ping c7-1 → c7-2 и c7-1 → 8.8.8.8.</w:t>
+      </w:r>
+    </w:p>
+    <w:p>
+      <w:pPr>
+        <w:jc w:val="center"/>
+      </w:pPr>
+      <w:r>
+        <w:drawing>
+          <wp:inline>
+            <wp:extent cx="5400000" cy="3445215"/>
+            <wp:docPr id="1" name="Picture 1"/>
+            <wp:cNvGraphicFramePr>
+              <a:graphicFrameLocks noChangeAspect="1"/>
+            </wp:cNvGraphicFramePr>
+            <a:graphic>
+              <a:graphicData uri="http://schemas.openxmlformats.org/drawingml/2006/picture">
+                <pic:pic>
+                  <pic:nvPicPr>
+                    <pic:cNvPr id="0" name="p1_c71.png"/>
+                    <pic:cNvPicPr/>
+                  </pic:nvPicPr>
+                  <pic:blipFill>
+                    <a:blip r:embed="rId8"/>
+                    <a:stretch>
+                      <a:fillRect/>
+                    </a:stretch>
+                  </pic:blipFill>
+                  <pic:spPr>
+                    <a:xfrm>
+                      <a:off x="0" y="0"/>
+                      <a:ext cx="5400000" cy="3445215"/>
+                    </a:xfrm>
+                    <a:prstGeom prst="rect"/>
+                  </pic:spPr>
+                </pic:pic>
+              </a:graphicData>
+            </a:graphic>
+          </wp:inline>
+        </w:drawing>
+      </w:r>
+    </w:p>
+    <w:p>
+      <w:pPr>
+        <w:jc w:val="center"/>
+      </w:pPr>
+      <w:r>
+        <w:rPr>
+          <w:rFonts w:ascii="Times New Roman" w:hAnsi="Times New Roman" w:eastAsia="Times New Roman"/>
+          <w:b w:val="0"/>
+          <w:sz w:val="20"/>
+        </w:rPr>
+        <w:t>Рисунок 1 — c7-1: адрес, ping до c7-2 и до 8.8.8.8</w:t>
+      </w:r>
+    </w:p>
+    <w:p>
+      <w:pPr>
+        <w:jc w:val="center"/>
+      </w:pPr>
+      <w:r>
+        <w:drawing>
+          <wp:inline>
+            <wp:extent cx="5400000" cy="1027919"/>
+            <wp:docPr id="2" name="Picture 2"/>
+            <wp:cNvGraphicFramePr>
+              <a:graphicFrameLocks noChangeAspect="1"/>
+            </wp:cNvGraphicFramePr>
+            <a:graphic>
+              <a:graphicData uri="http://schemas.openxmlformats.org/drawingml/2006/picture">
+                <pic:pic>
+                  <pic:nvPicPr>
+                    <pic:cNvPr id="0" name="p1_c72.png"/>
+                    <pic:cNvPicPr/>
+                  </pic:nvPicPr>
+                  <pic:blipFill>
+                    <a:blip r:embed="rId9"/>
+                    <a:stretch>
+                      <a:fillRect/>
+                    </a:stretch>
+                  </pic:blipFill>
+                  <pic:spPr>
+                    <a:xfrm>
+                      <a:off x="0" y="0"/>
+                      <a:ext cx="5400000" cy="1027919"/>
+                    </a:xfrm>
+                    <a:prstGeom prst="rect"/>
+                  </pic:spPr>
+                </pic:pic>
+              </a:graphicData>
+            </a:graphic>
+          </wp:inline>
+        </w:drawing>
+      </w:r>
+    </w:p>
+    <w:p>
+      <w:pPr>
+        <w:jc w:val="center"/>
+      </w:pPr>
+      <w:r>
+        <w:rPr>
+          <w:rFonts w:ascii="Times New Roman" w:hAnsi="Times New Roman" w:eastAsia="Times New Roman"/>
+          <w:b w:val="0"/>
+          <w:sz w:val="20"/>
+        </w:rPr>
+        <w:t>Рисунок 2 — c7-2: адрес интерфейса</w:t>
       </w:r>
     </w:p>
     <w:sectPr>

</xml_diff>

<commit_message>
Lab 3: Part 2 ping and mtr artifacts
Co-Authored-By: Claude Sonnet 5.5 <noreply@anthropic.com>
Claude-Session: https://claude.ai/code/session_01AxRBWGkpGe1tM1Y5SaPo4g
</commit_message>
<xml_diff>
--- a/lab3/lab-3_report.docx
+++ b/lab3/lab-3_report.docx
@@ -329,6 +329,77 @@
           <w:sz w:val="22"/>
         </w:rPr>
         <w:t>4. Определил адреса: c7-1 — 10.0.2.16/24, c7-2 — 10.0.2.4/24. Проверил связь между машинами и доступность внешней сети с c7-1 командой ping. Wireshark установлен на реальном хосте.</w:t>
+      </w:r>
+    </w:p>
+    <w:p/>
+    <w:p>
+      <w:r>
+        <w:rPr>
+          <w:rFonts w:ascii="Times New Roman" w:hAnsi="Times New Roman" w:eastAsia="Times New Roman"/>
+          <w:b/>
+          <w:sz w:val="24"/>
+        </w:rPr>
+        <w:t>Часть 2. Диагностика соединения</w:t>
+      </w:r>
+    </w:p>
+    <w:p>
+      <w:r>
+        <w:rPr>
+          <w:rFonts w:ascii="Times New Roman" w:hAnsi="Times New Roman" w:eastAsia="Times New Roman"/>
+          <w:b w:val="0"/>
+          <w:sz w:val="22"/>
+        </w:rPr>
+        <w:t>1. Изучил ключи ping (ping -h).</w:t>
+      </w:r>
+    </w:p>
+    <w:p>
+      <w:r>
+        <w:rPr>
+          <w:rFonts w:ascii="Times New Roman" w:hAnsi="Times New Roman" w:eastAsia="Times New Roman"/>
+          <w:b w:val="0"/>
+          <w:sz w:val="22"/>
+        </w:rPr>
+        <w:t>2. На c7-2 отправил на c7-1 5 пакетов размером 1500 байт данных с интервалом 10 секунд: ping -i 10 -c 5 -s 1500 10.0.2.16.</w:t>
+      </w:r>
+    </w:p>
+    <w:p>
+      <w:r>
+        <w:rPr>
+          <w:rFonts w:ascii="Times New Roman" w:hAnsi="Times New Roman" w:eastAsia="Times New Roman"/>
+          <w:b w:val="0"/>
+          <w:sz w:val="22"/>
+        </w:rPr>
+        <w:t>3. Ключ -f (flood) отправляет пакеты без пауз: на каждый отправленный запрос выводится точка, на каждый полученный ответ она стирается; доступен только root. Проверил на ping -f -c 100 между c7-1 и c7-2.</w:t>
+      </w:r>
+    </w:p>
+    <w:p>
+      <w:r>
+        <w:rPr>
+          <w:rFonts w:ascii="Times New Roman" w:hAnsi="Times New Roman" w:eastAsia="Times New Roman"/>
+          <w:b w:val="0"/>
+          <w:sz w:val="22"/>
+        </w:rPr>
+        <w:t>4. На c7-1 собрал статистику соединения с www.itmo.ru утилитой mtr в отчётном режиме: mtr -rwbc 10 www.itmo.ru.</w:t>
+      </w:r>
+    </w:p>
+    <w:p>
+      <w:r>
+        <w:rPr>
+          <w:rFonts w:ascii="Times New Roman" w:hAnsi="Times New Roman" w:eastAsia="Times New Roman"/>
+          <w:b w:val="0"/>
+          <w:sz w:val="22"/>
+        </w:rPr>
+        <w:t>5. Значения выводимых mtr параметров описаны в ответе на вопрос 2.</w:t>
+      </w:r>
+    </w:p>
+    <w:p>
+      <w:r>
+        <w:rPr>
+          <w:rFonts w:ascii="Times New Roman" w:hAnsi="Times New Roman" w:eastAsia="Times New Roman"/>
+          <w:b w:val="0"/>
+          <w:sz w:val="22"/>
+        </w:rPr>
+        <w:t>6. Сохранил в файл расширенную статистику mtr на 40 пакетов.</w:t>
       </w:r>
     </w:p>
     <w:p/>
@@ -460,6 +531,167 @@
           <w:sz w:val="20"/>
         </w:rPr>
         <w:t>Рисунок 2 — c7-2: адрес интерфейса</w:t>
+      </w:r>
+    </w:p>
+    <w:p>
+      <w:pPr>
+        <w:pStyle w:val="Heading2"/>
+      </w:pPr>
+      <w:r>
+        <w:t>Артефакт 1. ping и mtr (Часть 2, п. 2–4)</w:t>
+      </w:r>
+    </w:p>
+    <w:p>
+      <w:r>
+        <w:rPr>
+          <w:rFonts w:ascii="Times New Roman" w:hAnsi="Times New Roman" w:eastAsia="Times New Roman"/>
+          <w:b w:val="0"/>
+          <w:sz w:val="22"/>
+        </w:rPr>
+        <w:t>c7-2: ping с интервалом 10 с, 5 пакетов, 1500 байт; ping -f. c7-1: mtr до www.itmo.ru на 10 пакетов.</w:t>
+      </w:r>
+    </w:p>
+    <w:p>
+      <w:pPr>
+        <w:spacing w:after="0"/>
+      </w:pPr>
+      <w:r>
+        <w:rPr>
+          <w:rFonts w:ascii="Courier New" w:hAnsi="Courier New" w:eastAsia="Courier New"/>
+          <w:b w:val="0"/>
+          <w:sz w:val="17"/>
+        </w:rPr>
+        <w:t>ping -i 10 -c 5 -s 1500 10.0.2.16</w:t>
+      </w:r>
+    </w:p>
+    <w:p>
+      <w:pPr>
+        <w:spacing w:after="0"/>
+      </w:pPr>
+      <w:r>
+        <w:rPr>
+          <w:rFonts w:ascii="Courier New" w:hAnsi="Courier New" w:eastAsia="Courier New"/>
+          <w:b w:val="0"/>
+          <w:sz w:val="17"/>
+        </w:rPr>
+        <w:t>ping -f -c 100 10.0.2.16</w:t>
+      </w:r>
+    </w:p>
+    <w:p>
+      <w:pPr>
+        <w:spacing w:after="0"/>
+      </w:pPr>
+      <w:r>
+        <w:rPr>
+          <w:rFonts w:ascii="Courier New" w:hAnsi="Courier New" w:eastAsia="Courier New"/>
+          <w:b w:val="0"/>
+          <w:sz w:val="17"/>
+        </w:rPr>
+        <w:t>mtr -rwbc 10 www.itmo.ru</w:t>
+      </w:r>
+    </w:p>
+    <w:p>
+      <w:pPr>
+        <w:jc w:val="center"/>
+      </w:pPr>
+      <w:r>
+        <w:drawing>
+          <wp:inline>
+            <wp:extent cx="5400000" cy="2454545"/>
+            <wp:docPr id="3" name="Picture 3"/>
+            <wp:cNvGraphicFramePr>
+              <a:graphicFrameLocks noChangeAspect="1"/>
+            </wp:cNvGraphicFramePr>
+            <a:graphic>
+              <a:graphicData uri="http://schemas.openxmlformats.org/drawingml/2006/picture">
+                <pic:pic>
+                  <pic:nvPicPr>
+                    <pic:cNvPr id="0" name="p2_ping.png"/>
+                    <pic:cNvPicPr/>
+                  </pic:nvPicPr>
+                  <pic:blipFill>
+                    <a:blip r:embed="rId10"/>
+                    <a:stretch>
+                      <a:fillRect/>
+                    </a:stretch>
+                  </pic:blipFill>
+                  <pic:spPr>
+                    <a:xfrm>
+                      <a:off x="0" y="0"/>
+                      <a:ext cx="5400000" cy="2454545"/>
+                    </a:xfrm>
+                    <a:prstGeom prst="rect"/>
+                  </pic:spPr>
+                </pic:pic>
+              </a:graphicData>
+            </a:graphic>
+          </wp:inline>
+        </w:drawing>
+      </w:r>
+    </w:p>
+    <w:p>
+      <w:pPr>
+        <w:jc w:val="center"/>
+      </w:pPr>
+      <w:r>
+        <w:rPr>
+          <w:rFonts w:ascii="Times New Roman" w:hAnsi="Times New Roman" w:eastAsia="Times New Roman"/>
+          <w:b w:val="0"/>
+          <w:sz w:val="20"/>
+        </w:rPr>
+        <w:t>Рисунок 3 — ping с c7-2 на c7-1 (интервал 10 с, 1500 байт) и flood-ping</w:t>
+      </w:r>
+    </w:p>
+    <w:p>
+      <w:pPr>
+        <w:jc w:val="center"/>
+      </w:pPr>
+      <w:r>
+        <w:drawing>
+          <wp:inline>
+            <wp:extent cx="5400000" cy="736364"/>
+            <wp:docPr id="4" name="Picture 4"/>
+            <wp:cNvGraphicFramePr>
+              <a:graphicFrameLocks noChangeAspect="1"/>
+            </wp:cNvGraphicFramePr>
+            <a:graphic>
+              <a:graphicData uri="http://schemas.openxmlformats.org/drawingml/2006/picture">
+                <pic:pic>
+                  <pic:nvPicPr>
+                    <pic:cNvPr id="0" name="p2_mtr10.png"/>
+                    <pic:cNvPicPr/>
+                  </pic:nvPicPr>
+                  <pic:blipFill>
+                    <a:blip r:embed="rId11"/>
+                    <a:stretch>
+                      <a:fillRect/>
+                    </a:stretch>
+                  </pic:blipFill>
+                  <pic:spPr>
+                    <a:xfrm>
+                      <a:off x="0" y="0"/>
+                      <a:ext cx="5400000" cy="736364"/>
+                    </a:xfrm>
+                    <a:prstGeom prst="rect"/>
+                  </pic:spPr>
+                </pic:pic>
+              </a:graphicData>
+            </a:graphic>
+          </wp:inline>
+        </w:drawing>
+      </w:r>
+    </w:p>
+    <w:p>
+      <w:pPr>
+        <w:jc w:val="center"/>
+      </w:pPr>
+      <w:r>
+        <w:rPr>
+          <w:rFonts w:ascii="Times New Roman" w:hAnsi="Times New Roman" w:eastAsia="Times New Roman"/>
+          <w:b w:val="0"/>
+          <w:sz w:val="20"/>
+        </w:rPr>
+        <w:t>Рисунок 4 — mtr до www.itmo.ru</w:t>
       </w:r>
     </w:p>
     <w:sectPr>

</xml_diff>

<commit_message>
Lab 3: mtr extended stats file
Co-Authored-By: Claude Sonnet 5.5 <noreply@anthropic.com>
Claude-Session: https://claude.ai/code/session_01AxRBWGkpGe1tM1Y5SaPo4g
</commit_message>
<xml_diff>
--- a/lab3/lab-3_report.docx
+++ b/lab3/lab-3_report.docx
@@ -692,6 +692,102 @@
           <w:sz w:val="20"/>
         </w:rPr>
         <w:t>Рисунок 4 — mtr до www.itmo.ru</w:t>
+      </w:r>
+    </w:p>
+    <w:p>
+      <w:pPr>
+        <w:pStyle w:val="Heading2"/>
+      </w:pPr>
+      <w:r>
+        <w:t>Артефакт 2. Расширенная статистика mtr в файле (Часть 2, п. 6)</w:t>
+      </w:r>
+    </w:p>
+    <w:p>
+      <w:r>
+        <w:rPr>
+          <w:rFonts w:ascii="Times New Roman" w:hAnsi="Times New Roman" w:eastAsia="Times New Roman"/>
+          <w:b w:val="0"/>
+          <w:sz w:val="22"/>
+        </w:rPr>
+        <w:t>Команда сохраняет в файл mtr_itmo.txt отчёт по 40 пакетам: -r отчётный режим, -w широкий вывод, -b имя и адрес узла, -c 40 число пакетов, -o задаёт столбцы (L — потери, S — отправлено, R — получено, N — последний, B — лучший, A — средний, W — худший, V — стандартное отклонение).</w:t>
+      </w:r>
+    </w:p>
+    <w:p>
+      <w:pPr>
+        <w:spacing w:after="0"/>
+      </w:pPr>
+      <w:r>
+        <w:rPr>
+          <w:rFonts w:ascii="Courier New" w:hAnsi="Courier New" w:eastAsia="Courier New"/>
+          <w:b w:val="0"/>
+          <w:sz w:val="17"/>
+        </w:rPr>
+        <w:t>mtr -rwbc 40 -o "LSRNBAWV" www.itmo.ru &gt; mtr_itmo.txt</w:t>
+      </w:r>
+    </w:p>
+    <w:p>
+      <w:pPr>
+        <w:spacing w:after="0"/>
+      </w:pPr>
+      <w:r>
+        <w:rPr>
+          <w:rFonts w:ascii="Courier New" w:hAnsi="Courier New" w:eastAsia="Courier New"/>
+          <w:b w:val="0"/>
+          <w:sz w:val="17"/>
+        </w:rPr>
+        <w:t>cat mtr_itmo.txt</w:t>
+      </w:r>
+    </w:p>
+    <w:p>
+      <w:pPr>
+        <w:jc w:val="center"/>
+      </w:pPr>
+      <w:r>
+        <w:drawing>
+          <wp:inline>
+            <wp:extent cx="5400000" cy="735000"/>
+            <wp:docPr id="5" name="Picture 5"/>
+            <wp:cNvGraphicFramePr>
+              <a:graphicFrameLocks noChangeAspect="1"/>
+            </wp:cNvGraphicFramePr>
+            <a:graphic>
+              <a:graphicData uri="http://schemas.openxmlformats.org/drawingml/2006/picture">
+                <pic:pic>
+                  <pic:nvPicPr>
+                    <pic:cNvPr id="0" name="p2_mtr40.png"/>
+                    <pic:cNvPicPr/>
+                  </pic:nvPicPr>
+                  <pic:blipFill>
+                    <a:blip r:embed="rId12"/>
+                    <a:stretch>
+                      <a:fillRect/>
+                    </a:stretch>
+                  </pic:blipFill>
+                  <pic:spPr>
+                    <a:xfrm>
+                      <a:off x="0" y="0"/>
+                      <a:ext cx="5400000" cy="735000"/>
+                    </a:xfrm>
+                    <a:prstGeom prst="rect"/>
+                  </pic:spPr>
+                </pic:pic>
+              </a:graphicData>
+            </a:graphic>
+          </wp:inline>
+        </w:drawing>
+      </w:r>
+    </w:p>
+    <w:p>
+      <w:pPr>
+        <w:jc w:val="center"/>
+      </w:pPr>
+      <w:r>
+        <w:rPr>
+          <w:rFonts w:ascii="Times New Roman" w:hAnsi="Times New Roman" w:eastAsia="Times New Roman"/>
+          <w:b w:val="0"/>
+          <w:sz w:val="20"/>
+        </w:rPr>
+        <w:t>Рисунок 5 — Файл mtr_itmo.txt</w:t>
       </w:r>
     </w:p>
     <w:sectPr>

</xml_diff>

<commit_message>
Lab 3: mtr protocol evidence
Co-Authored-By: Claude Sonnet 5.5 <noreply@anthropic.com>
Claude-Session: https://claude.ai/code/session_01AxRBWGkpGe1tM1Y5SaPo4g
</commit_message>
<xml_diff>
--- a/lab3/lab-3_report.docx
+++ b/lab3/lab-3_report.docx
@@ -788,6 +788,102 @@
           <w:sz w:val="20"/>
         </w:rPr>
         <w:t>Рисунок 5 — Файл mtr_itmo.txt</w:t>
+      </w:r>
+    </w:p>
+    <w:p>
+      <w:pPr>
+        <w:pStyle w:val="Heading2"/>
+      </w:pPr>
+      <w:r>
+        <w:t>Артефакт 3. Определение протокола mtr (ответ на вопрос 1)</w:t>
+      </w:r>
+    </w:p>
+    <w:p>
+      <w:r>
+        <w:rPr>
+          <w:rFonts w:ascii="Times New Roman" w:hAnsi="Times New Roman" w:eastAsia="Times New Roman"/>
+          <w:b w:val="0"/>
+          <w:sz w:val="22"/>
+        </w:rPr>
+        <w:t>Во время работы mtr на c7-1 запущен tcpdump с фильтром icmp: перехвачены ICMP echo request и echo reply между 10.0.2.16 и 51.250.116.144 (адрес www.itmo.ru), то есть mtr по умолчанию использует ICMP.</w:t>
+      </w:r>
+    </w:p>
+    <w:p>
+      <w:pPr>
+        <w:spacing w:after="0"/>
+      </w:pPr>
+      <w:r>
+        <w:rPr>
+          <w:rFonts w:ascii="Courier New" w:hAnsi="Courier New" w:eastAsia="Courier New"/>
+          <w:b w:val="0"/>
+          <w:sz w:val="17"/>
+        </w:rPr>
+        <w:t>tcpdump -ni enp0s3 -c 6 icmp &amp;</w:t>
+      </w:r>
+    </w:p>
+    <w:p>
+      <w:pPr>
+        <w:spacing w:after="0"/>
+      </w:pPr>
+      <w:r>
+        <w:rPr>
+          <w:rFonts w:ascii="Courier New" w:hAnsi="Courier New" w:eastAsia="Courier New"/>
+          <w:b w:val="0"/>
+          <w:sz w:val="17"/>
+        </w:rPr>
+        <w:t>mtr -rwc 3 www.itmo.ru</w:t>
+      </w:r>
+    </w:p>
+    <w:p>
+      <w:pPr>
+        <w:jc w:val="center"/>
+      </w:pPr>
+      <w:r>
+        <w:drawing>
+          <wp:inline>
+            <wp:extent cx="5400000" cy="2415000"/>
+            <wp:docPr id="6" name="Picture 6"/>
+            <wp:cNvGraphicFramePr>
+              <a:graphicFrameLocks noChangeAspect="1"/>
+            </wp:cNvGraphicFramePr>
+            <a:graphic>
+              <a:graphicData uri="http://schemas.openxmlformats.org/drawingml/2006/picture">
+                <pic:pic>
+                  <pic:nvPicPr>
+                    <pic:cNvPr id="0" name="p2_proto.png"/>
+                    <pic:cNvPicPr/>
+                  </pic:nvPicPr>
+                  <pic:blipFill>
+                    <a:blip r:embed="rId13"/>
+                    <a:stretch>
+                      <a:fillRect/>
+                    </a:stretch>
+                  </pic:blipFill>
+                  <pic:spPr>
+                    <a:xfrm>
+                      <a:off x="0" y="0"/>
+                      <a:ext cx="5400000" cy="2415000"/>
+                    </a:xfrm>
+                    <a:prstGeom prst="rect"/>
+                  </pic:spPr>
+                </pic:pic>
+              </a:graphicData>
+            </a:graphic>
+          </wp:inline>
+        </w:drawing>
+      </w:r>
+    </w:p>
+    <w:p>
+      <w:pPr>
+        <w:jc w:val="center"/>
+      </w:pPr>
+      <w:r>
+        <w:rPr>
+          <w:rFonts w:ascii="Times New Roman" w:hAnsi="Times New Roman" w:eastAsia="Times New Roman"/>
+          <w:b w:val="0"/>
+          <w:sz w:val="20"/>
+        </w:rPr>
+        <w:t>Рисунок 6 — tcpdump во время работы mtr</w:t>
       </w:r>
     </w:p>
     <w:sectPr>

</xml_diff>

<commit_message>
Lab 3: Part 3 report and answers
Co-Authored-By: Claude Sonnet 5.5 <noreply@anthropic.com>
Claude-Session: https://claude.ai/code/session_01AxRBWGkpGe1tM1Y5SaPo4g
</commit_message>
<xml_diff>
--- a/lab3/lab-3_report.docx
+++ b/lab3/lab-3_report.docx
@@ -400,6 +400,67 @@
           <w:sz w:val="22"/>
         </w:rPr>
         <w:t>6. Сохранил в файл расширенную статистику mtr на 40 пакетов.</w:t>
+      </w:r>
+    </w:p>
+    <w:p/>
+    <w:p>
+      <w:r>
+        <w:rPr>
+          <w:rFonts w:ascii="Times New Roman" w:hAnsi="Times New Roman" w:eastAsia="Times New Roman"/>
+          <w:b/>
+          <w:sz w:val="24"/>
+        </w:rPr>
+        <w:t>Часть 3. Работа с Wireshark</w:t>
+      </w:r>
+    </w:p>
+    <w:p>
+      <w:r>
+        <w:rPr>
+          <w:rFonts w:ascii="Times New Roman" w:hAnsi="Times New Roman" w:eastAsia="Times New Roman"/>
+          <w:b w:val="0"/>
+          <w:sz w:val="22"/>
+        </w:rPr>
+        <w:t>1. Установил Wireshark 4.6.9 и драйвер Npcap на реальный компьютер (Windows). Захват настроил на интерфейс «Беспроводная сеть» (адрес 192.168.1.22, MAC e8:fb:1c:4f:61:f5), в параметрах включил автоматическую остановку после 5 МБ, файл lab3.pcapng. Открыл несколько сайтов; захват остановился сам: 5561 пакет, 5 000 424 байт, 40 секунд, потерь нет.</w:t>
+      </w:r>
+    </w:p>
+    <w:p>
+      <w:r>
+        <w:rPr>
+          <w:rFonts w:ascii="Times New Roman" w:hAnsi="Times New Roman" w:eastAsia="Times New Roman"/>
+          <w:b w:val="0"/>
+          <w:sz w:val="22"/>
+        </w:rPr>
+        <w:t>2. По окну «Конечные точки» определил: самый активный узел по объёму — 192.168.1.22 (5540 пакетов, около 5 МБ), среди удалённых 187.7.207.194 (2918 пакетов, 2 МБ); наибольшее число широковещательных рассылок — 192.168.1.22 (MAC e8:fb:1c:4f:61:f5), все 69 кадров; самый активный TCP-порт — 443 (187.7.207.194:443 — 2918 пакетов, 187.7.207.162:443 — 2489).</w:t>
+      </w:r>
+    </w:p>
+    <w:p>
+      <w:r>
+        <w:rPr>
+          <w:rFonts w:ascii="Times New Roman" w:hAnsi="Times New Roman" w:eastAsia="Times New Roman"/>
+          <w:b w:val="0"/>
+          <w:sz w:val="22"/>
+        </w:rPr>
+        <w:t>3. В «Графиках ввода/вывода» построил на одной сетке графики TCP (фильтр tcp) и UDP (фильтр udp): TCP составляет почти весь трафик с пиками до 900 пакетов/с, UDP около нуля. Построил диаграмму потока для пакетов с фильтром tls (HTTPS): обмен Application Data с узлами 187.7.207.194 и 187.7.207.162 по порту 443.</w:t>
+      </w:r>
+    </w:p>
+    <w:p>
+      <w:r>
+        <w:rPr>
+          <w:rFonts w:ascii="Times New Roman" w:hAnsi="Times New Roman" w:eastAsia="Times New Roman"/>
+          <w:b w:val="0"/>
+          <w:sz w:val="22"/>
+        </w:rPr>
+        <w:t>4. Написал фильтры: DNS-клиент, все кадры отправленные интерфейсом хоста (eth.src), широковещательные кадры (eth.dst). DNS-клиент в захвате по Wi-Fi не виден: имена разрешаются через виртуальный адаптер happ-xray (DNS-сервер 172.19.0.2). Поэтому DNS-запросы показал отдельным захватом на этом адаптере. Недостающий третий широковещательный протокол получил отдельным захватом, отправив ping на 192.168.1.255.</w:t>
+      </w:r>
+    </w:p>
+    <w:p>
+      <w:r>
+        <w:rPr>
+          <w:rFonts w:ascii="Times New Roman" w:hAnsi="Times New Roman" w:eastAsia="Times New Roman"/>
+          <w:b w:val="0"/>
+          <w:sz w:val="22"/>
+        </w:rPr>
+        <w:t>5. Определил тип оборудования по MAC-адресам: в захвате только адрес компьютера, адрес шлюза (маршрутизатора) 38:d5:47:41:88:34 и широковещательный адрес.</w:t>
       </w:r>
     </w:p>
     <w:p/>
@@ -884,6 +945,1208 @@
           <w:sz w:val="20"/>
         </w:rPr>
         <w:t>Рисунок 6 — tcpdump во время работы mtr</w:t>
+      </w:r>
+    </w:p>
+    <w:p>
+      <w:pPr>
+        <w:pStyle w:val="Heading2"/>
+      </w:pPr>
+      <w:r>
+        <w:t>Артефакт 4. Настройки захвата Wireshark (Часть 3, п. 1)</w:t>
+      </w:r>
+    </w:p>
+    <w:p>
+      <w:r>
+        <w:rPr>
+          <w:rFonts w:ascii="Times New Roman" w:hAnsi="Times New Roman" w:eastAsia="Times New Roman"/>
+          <w:b w:val="0"/>
+          <w:sz w:val="22"/>
+        </w:rPr>
+        <w:t>Автоматическая остановка захвата после 5 МБ и сохранение в файл lab3.pcapng. Размер полученного файла 5 000 424 байт.</w:t>
+      </w:r>
+    </w:p>
+    <w:p>
+      <w:pPr>
+        <w:jc w:val="center"/>
+      </w:pPr>
+      <w:r>
+        <w:drawing>
+          <wp:inline>
+            <wp:extent cx="5400000" cy="3086364"/>
+            <wp:docPr id="7" name="Picture 7"/>
+            <wp:cNvGraphicFramePr>
+              <a:graphicFrameLocks noChangeAspect="1"/>
+            </wp:cNvGraphicFramePr>
+            <a:graphic>
+              <a:graphicData uri="http://schemas.openxmlformats.org/drawingml/2006/picture">
+                <pic:pic>
+                  <pic:nvPicPr>
+                    <pic:cNvPr id="0" name="p3_opts.png"/>
+                    <pic:cNvPicPr/>
+                  </pic:nvPicPr>
+                  <pic:blipFill>
+                    <a:blip r:embed="rId14"/>
+                    <a:stretch>
+                      <a:fillRect/>
+                    </a:stretch>
+                  </pic:blipFill>
+                  <pic:spPr>
+                    <a:xfrm>
+                      <a:off x="0" y="0"/>
+                      <a:ext cx="5400000" cy="3086364"/>
+                    </a:xfrm>
+                    <a:prstGeom prst="rect"/>
+                  </pic:spPr>
+                </pic:pic>
+              </a:graphicData>
+            </a:graphic>
+          </wp:inline>
+        </w:drawing>
+      </w:r>
+    </w:p>
+    <w:p>
+      <w:pPr>
+        <w:jc w:val="center"/>
+      </w:pPr>
+      <w:r>
+        <w:rPr>
+          <w:rFonts w:ascii="Times New Roman" w:hAnsi="Times New Roman" w:eastAsia="Times New Roman"/>
+          <w:b w:val="0"/>
+          <w:sz w:val="20"/>
+        </w:rPr>
+        <w:t>Рисунок 7 — Остановка захвата после 5 МБ</w:t>
+      </w:r>
+    </w:p>
+    <w:p>
+      <w:pPr>
+        <w:jc w:val="center"/>
+      </w:pPr>
+      <w:r>
+        <w:drawing>
+          <wp:inline>
+            <wp:extent cx="5400000" cy="3086364"/>
+            <wp:docPr id="8" name="Picture 8"/>
+            <wp:cNvGraphicFramePr>
+              <a:graphicFrameLocks noChangeAspect="1"/>
+            </wp:cNvGraphicFramePr>
+            <a:graphic>
+              <a:graphicData uri="http://schemas.openxmlformats.org/drawingml/2006/picture">
+                <pic:pic>
+                  <pic:nvPicPr>
+                    <pic:cNvPr id="0" name="p3_out.png"/>
+                    <pic:cNvPicPr/>
+                  </pic:nvPicPr>
+                  <pic:blipFill>
+                    <a:blip r:embed="rId15"/>
+                    <a:stretch>
+                      <a:fillRect/>
+                    </a:stretch>
+                  </pic:blipFill>
+                  <pic:spPr>
+                    <a:xfrm>
+                      <a:off x="0" y="0"/>
+                      <a:ext cx="5400000" cy="3086364"/>
+                    </a:xfrm>
+                    <a:prstGeom prst="rect"/>
+                  </pic:spPr>
+                </pic:pic>
+              </a:graphicData>
+            </a:graphic>
+          </wp:inline>
+        </w:drawing>
+      </w:r>
+    </w:p>
+    <w:p>
+      <w:pPr>
+        <w:jc w:val="center"/>
+      </w:pPr>
+      <w:r>
+        <w:rPr>
+          <w:rFonts w:ascii="Times New Roman" w:hAnsi="Times New Roman" w:eastAsia="Times New Roman"/>
+          <w:b w:val="0"/>
+          <w:sz w:val="20"/>
+        </w:rPr>
+        <w:t>Рисунок 8 — Файл захвата lab3.pcapng</w:t>
+      </w:r>
+    </w:p>
+    <w:p>
+      <w:pPr>
+        <w:jc w:val="center"/>
+      </w:pPr>
+      <w:r>
+        <w:drawing>
+          <wp:inline>
+            <wp:extent cx="5400000" cy="6984906"/>
+            <wp:docPr id="9" name="Picture 9"/>
+            <wp:cNvGraphicFramePr>
+              <a:graphicFrameLocks noChangeAspect="1"/>
+            </wp:cNvGraphicFramePr>
+            <a:graphic>
+              <a:graphicData uri="http://schemas.openxmlformats.org/drawingml/2006/picture">
+                <pic:pic>
+                  <pic:nvPicPr>
+                    <pic:cNvPr id="0" name="p3_size.png"/>
+                    <pic:cNvPicPr/>
+                  </pic:nvPicPr>
+                  <pic:blipFill>
+                    <a:blip r:embed="rId16"/>
+                    <a:stretch>
+                      <a:fillRect/>
+                    </a:stretch>
+                  </pic:blipFill>
+                  <pic:spPr>
+                    <a:xfrm>
+                      <a:off x="0" y="0"/>
+                      <a:ext cx="5400000" cy="6984906"/>
+                    </a:xfrm>
+                    <a:prstGeom prst="rect"/>
+                  </pic:spPr>
+                </pic:pic>
+              </a:graphicData>
+            </a:graphic>
+          </wp:inline>
+        </w:drawing>
+      </w:r>
+    </w:p>
+    <w:p>
+      <w:pPr>
+        <w:jc w:val="center"/>
+      </w:pPr>
+      <w:r>
+        <w:rPr>
+          <w:rFonts w:ascii="Times New Roman" w:hAnsi="Times New Roman" w:eastAsia="Times New Roman"/>
+          <w:b w:val="0"/>
+          <w:sz w:val="20"/>
+        </w:rPr>
+        <w:t>Рисунок 9 — Размер файла захвата</w:t>
+      </w:r>
+    </w:p>
+    <w:p>
+      <w:pPr>
+        <w:pStyle w:val="Heading2"/>
+      </w:pPr>
+      <w:r>
+        <w:t>Артефакт 5. Статистика: активный узел, широковещание, TCP-порт (Часть 3, п. 2.1–2.3)</w:t>
+      </w:r>
+    </w:p>
+    <w:p>
+      <w:r>
+        <w:rPr>
+          <w:rFonts w:ascii="Times New Roman" w:hAnsi="Times New Roman" w:eastAsia="Times New Roman"/>
+          <w:b w:val="0"/>
+          <w:sz w:val="22"/>
+        </w:rPr>
+        <w:t>Статистика → Конечные точки. IPv4 (сортировка по байтам): максимум у 192.168.1.22. Ethernet: в захвате три адреса — широковещательный, маршрутизатор 38:d5:47:41:88:34 и компьютер e8:fb:1c:4f:61:f5. Ethernet с фильтром eth.dst == ff:ff:ff:ff:ff:ff (опция «Ограничить фильтром отображения»): все 69 кадров отправил e8:fb:1c:4f:61:f5. TCP (сортировка по пакетам): порт 443.</w:t>
+      </w:r>
+    </w:p>
+    <w:p>
+      <w:pPr>
+        <w:jc w:val="center"/>
+      </w:pPr>
+      <w:r>
+        <w:drawing>
+          <wp:inline>
+            <wp:extent cx="5400000" cy="1052396"/>
+            <wp:docPr id="10" name="Picture 10"/>
+            <wp:cNvGraphicFramePr>
+              <a:graphicFrameLocks noChangeAspect="1"/>
+            </wp:cNvGraphicFramePr>
+            <a:graphic>
+              <a:graphicData uri="http://schemas.openxmlformats.org/drawingml/2006/picture">
+                <pic:pic>
+                  <pic:nvPicPr>
+                    <pic:cNvPr id="0" name="p3_ipv4.png"/>
+                    <pic:cNvPicPr/>
+                  </pic:nvPicPr>
+                  <pic:blipFill>
+                    <a:blip r:embed="rId17"/>
+                    <a:stretch>
+                      <a:fillRect/>
+                    </a:stretch>
+                  </pic:blipFill>
+                  <pic:spPr>
+                    <a:xfrm>
+                      <a:off x="0" y="0"/>
+                      <a:ext cx="5400000" cy="1052396"/>
+                    </a:xfrm>
+                    <a:prstGeom prst="rect"/>
+                  </pic:spPr>
+                </pic:pic>
+              </a:graphicData>
+            </a:graphic>
+          </wp:inline>
+        </w:drawing>
+      </w:r>
+    </w:p>
+    <w:p>
+      <w:pPr>
+        <w:jc w:val="center"/>
+      </w:pPr>
+      <w:r>
+        <w:rPr>
+          <w:rFonts w:ascii="Times New Roman" w:hAnsi="Times New Roman" w:eastAsia="Times New Roman"/>
+          <w:b w:val="0"/>
+          <w:sz w:val="20"/>
+        </w:rPr>
+        <w:t>Рисунок 10 — Конечные точки IPv4</w:t>
+      </w:r>
+    </w:p>
+    <w:p>
+      <w:pPr>
+        <w:jc w:val="center"/>
+      </w:pPr>
+      <w:r>
+        <w:drawing>
+          <wp:inline>
+            <wp:extent cx="5400000" cy="740102"/>
+            <wp:docPr id="11" name="Picture 11"/>
+            <wp:cNvGraphicFramePr>
+              <a:graphicFrameLocks noChangeAspect="1"/>
+            </wp:cNvGraphicFramePr>
+            <a:graphic>
+              <a:graphicData uri="http://schemas.openxmlformats.org/drawingml/2006/picture">
+                <pic:pic>
+                  <pic:nvPicPr>
+                    <pic:cNvPr id="0" name="p3_eth_all.png"/>
+                    <pic:cNvPicPr/>
+                  </pic:nvPicPr>
+                  <pic:blipFill>
+                    <a:blip r:embed="rId18"/>
+                    <a:stretch>
+                      <a:fillRect/>
+                    </a:stretch>
+                  </pic:blipFill>
+                  <pic:spPr>
+                    <a:xfrm>
+                      <a:off x="0" y="0"/>
+                      <a:ext cx="5400000" cy="740102"/>
+                    </a:xfrm>
+                    <a:prstGeom prst="rect"/>
+                  </pic:spPr>
+                </pic:pic>
+              </a:graphicData>
+            </a:graphic>
+          </wp:inline>
+        </w:drawing>
+      </w:r>
+    </w:p>
+    <w:p>
+      <w:pPr>
+        <w:jc w:val="center"/>
+      </w:pPr>
+      <w:r>
+        <w:rPr>
+          <w:rFonts w:ascii="Times New Roman" w:hAnsi="Times New Roman" w:eastAsia="Times New Roman"/>
+          <w:b w:val="0"/>
+          <w:sz w:val="20"/>
+        </w:rPr>
+        <w:t>Рисунок 11 — Конечные точки Ethernet (весь захват)</w:t>
+      </w:r>
+    </w:p>
+    <w:p>
+      <w:pPr>
+        <w:jc w:val="center"/>
+      </w:pPr>
+      <w:r>
+        <w:drawing>
+          <wp:inline>
+            <wp:extent cx="5400000" cy="439024"/>
+            <wp:docPr id="12" name="Picture 12"/>
+            <wp:cNvGraphicFramePr>
+              <a:graphicFrameLocks noChangeAspect="1"/>
+            </wp:cNvGraphicFramePr>
+            <a:graphic>
+              <a:graphicData uri="http://schemas.openxmlformats.org/drawingml/2006/picture">
+                <pic:pic>
+                  <pic:nvPicPr>
+                    <pic:cNvPr id="0" name="p3_eth_bcast.png"/>
+                    <pic:cNvPicPr/>
+                  </pic:nvPicPr>
+                  <pic:blipFill>
+                    <a:blip r:embed="rId19"/>
+                    <a:stretch>
+                      <a:fillRect/>
+                    </a:stretch>
+                  </pic:blipFill>
+                  <pic:spPr>
+                    <a:xfrm>
+                      <a:off x="0" y="0"/>
+                      <a:ext cx="5400000" cy="439024"/>
+                    </a:xfrm>
+                    <a:prstGeom prst="rect"/>
+                  </pic:spPr>
+                </pic:pic>
+              </a:graphicData>
+            </a:graphic>
+          </wp:inline>
+        </w:drawing>
+      </w:r>
+    </w:p>
+    <w:p>
+      <w:pPr>
+        <w:jc w:val="center"/>
+      </w:pPr>
+      <w:r>
+        <w:rPr>
+          <w:rFonts w:ascii="Times New Roman" w:hAnsi="Times New Roman" w:eastAsia="Times New Roman"/>
+          <w:b w:val="0"/>
+          <w:sz w:val="20"/>
+        </w:rPr>
+        <w:t>Рисунок 12 — Конечные точки Ethernet при фильтре на широковещательные кадры</w:t>
+      </w:r>
+    </w:p>
+    <w:p>
+      <w:pPr>
+        <w:jc w:val="center"/>
+      </w:pPr>
+      <w:r>
+        <w:drawing>
+          <wp:inline>
+            <wp:extent cx="5400000" cy="4276301"/>
+            <wp:docPr id="13" name="Picture 13"/>
+            <wp:cNvGraphicFramePr>
+              <a:graphicFrameLocks noChangeAspect="1"/>
+            </wp:cNvGraphicFramePr>
+            <a:graphic>
+              <a:graphicData uri="http://schemas.openxmlformats.org/drawingml/2006/picture">
+                <pic:pic>
+                  <pic:nvPicPr>
+                    <pic:cNvPr id="0" name="p3_tcp.png"/>
+                    <pic:cNvPicPr/>
+                  </pic:nvPicPr>
+                  <pic:blipFill>
+                    <a:blip r:embed="rId20"/>
+                    <a:stretch>
+                      <a:fillRect/>
+                    </a:stretch>
+                  </pic:blipFill>
+                  <pic:spPr>
+                    <a:xfrm>
+                      <a:off x="0" y="0"/>
+                      <a:ext cx="5400000" cy="4276301"/>
+                    </a:xfrm>
+                    <a:prstGeom prst="rect"/>
+                  </pic:spPr>
+                </pic:pic>
+              </a:graphicData>
+            </a:graphic>
+          </wp:inline>
+        </w:drawing>
+      </w:r>
+    </w:p>
+    <w:p>
+      <w:pPr>
+        <w:jc w:val="center"/>
+      </w:pPr>
+      <w:r>
+        <w:rPr>
+          <w:rFonts w:ascii="Times New Roman" w:hAnsi="Times New Roman" w:eastAsia="Times New Roman"/>
+          <w:b w:val="0"/>
+          <w:sz w:val="20"/>
+        </w:rPr>
+        <w:t>Рисунок 13 — Конечные точки TCP</w:t>
+      </w:r>
+    </w:p>
+    <w:p>
+      <w:pPr>
+        <w:pStyle w:val="Heading2"/>
+      </w:pPr>
+      <w:r>
+        <w:t>Артефакт 6. Графики и диаграмма потока (Часть 3, п. 2.4–2.5)</w:t>
+      </w:r>
+    </w:p>
+    <w:p>
+      <w:r>
+        <w:rPr>
+          <w:rFonts w:ascii="Times New Roman" w:hAnsi="Times New Roman" w:eastAsia="Times New Roman"/>
+          <w:b w:val="0"/>
+          <w:sz w:val="22"/>
+        </w:rPr>
+        <w:t>График интенсивности TCP (фильтр tcp) и UDP (фильтр udp) на одной сетке, интервал 1 с. Диаграмма потока построена для пакетов HTTPS (фильтр tls).</w:t>
+      </w:r>
+    </w:p>
+    <w:p>
+      <w:pPr>
+        <w:spacing w:after="0"/>
+      </w:pPr>
+      <w:r>
+        <w:rPr>
+          <w:rFonts w:ascii="Courier New" w:hAnsi="Courier New" w:eastAsia="Courier New"/>
+          <w:b w:val="0"/>
+          <w:sz w:val="17"/>
+        </w:rPr>
+        <w:t>tcp</w:t>
+      </w:r>
+    </w:p>
+    <w:p>
+      <w:pPr>
+        <w:spacing w:after="0"/>
+      </w:pPr>
+      <w:r>
+        <w:rPr>
+          <w:rFonts w:ascii="Courier New" w:hAnsi="Courier New" w:eastAsia="Courier New"/>
+          <w:b w:val="0"/>
+          <w:sz w:val="17"/>
+        </w:rPr>
+        <w:t>udp</w:t>
+      </w:r>
+    </w:p>
+    <w:p>
+      <w:pPr>
+        <w:spacing w:after="0"/>
+      </w:pPr>
+      <w:r>
+        <w:rPr>
+          <w:rFonts w:ascii="Courier New" w:hAnsi="Courier New" w:eastAsia="Courier New"/>
+          <w:b w:val="0"/>
+          <w:sz w:val="17"/>
+        </w:rPr>
+        <w:t>tls</w:t>
+      </w:r>
+    </w:p>
+    <w:p>
+      <w:pPr>
+        <w:jc w:val="center"/>
+      </w:pPr>
+      <w:r>
+        <w:drawing>
+          <wp:inline>
+            <wp:extent cx="5400000" cy="2986680"/>
+            <wp:docPr id="14" name="Picture 14"/>
+            <wp:cNvGraphicFramePr>
+              <a:graphicFrameLocks noChangeAspect="1"/>
+            </wp:cNvGraphicFramePr>
+            <a:graphic>
+              <a:graphicData uri="http://schemas.openxmlformats.org/drawingml/2006/picture">
+                <pic:pic>
+                  <pic:nvPicPr>
+                    <pic:cNvPr id="0" name="p3_io.png"/>
+                    <pic:cNvPicPr/>
+                  </pic:nvPicPr>
+                  <pic:blipFill>
+                    <a:blip r:embed="rId21"/>
+                    <a:stretch>
+                      <a:fillRect/>
+                    </a:stretch>
+                  </pic:blipFill>
+                  <pic:spPr>
+                    <a:xfrm>
+                      <a:off x="0" y="0"/>
+                      <a:ext cx="5400000" cy="2986680"/>
+                    </a:xfrm>
+                    <a:prstGeom prst="rect"/>
+                  </pic:spPr>
+                </pic:pic>
+              </a:graphicData>
+            </a:graphic>
+          </wp:inline>
+        </w:drawing>
+      </w:r>
+    </w:p>
+    <w:p>
+      <w:pPr>
+        <w:jc w:val="center"/>
+      </w:pPr>
+      <w:r>
+        <w:rPr>
+          <w:rFonts w:ascii="Times New Roman" w:hAnsi="Times New Roman" w:eastAsia="Times New Roman"/>
+          <w:b w:val="0"/>
+          <w:sz w:val="20"/>
+        </w:rPr>
+        <w:t>Рисунок 14 — Графики TCP и UDP</w:t>
+      </w:r>
+    </w:p>
+    <w:p>
+      <w:pPr>
+        <w:jc w:val="center"/>
+      </w:pPr>
+      <w:r>
+        <w:drawing>
+          <wp:inline>
+            <wp:extent cx="5400000" cy="1745098"/>
+            <wp:docPr id="15" name="Picture 15"/>
+            <wp:cNvGraphicFramePr>
+              <a:graphicFrameLocks noChangeAspect="1"/>
+            </wp:cNvGraphicFramePr>
+            <a:graphic>
+              <a:graphicData uri="http://schemas.openxmlformats.org/drawingml/2006/picture">
+                <pic:pic>
+                  <pic:nvPicPr>
+                    <pic:cNvPr id="0" name="p3_tls.png"/>
+                    <pic:cNvPicPr/>
+                  </pic:nvPicPr>
+                  <pic:blipFill>
+                    <a:blip r:embed="rId22"/>
+                    <a:stretch>
+                      <a:fillRect/>
+                    </a:stretch>
+                  </pic:blipFill>
+                  <pic:spPr>
+                    <a:xfrm>
+                      <a:off x="0" y="0"/>
+                      <a:ext cx="5400000" cy="1745098"/>
+                    </a:xfrm>
+                    <a:prstGeom prst="rect"/>
+                  </pic:spPr>
+                </pic:pic>
+              </a:graphicData>
+            </a:graphic>
+          </wp:inline>
+        </w:drawing>
+      </w:r>
+    </w:p>
+    <w:p>
+      <w:pPr>
+        <w:jc w:val="center"/>
+      </w:pPr>
+      <w:r>
+        <w:rPr>
+          <w:rFonts w:ascii="Times New Roman" w:hAnsi="Times New Roman" w:eastAsia="Times New Roman"/>
+          <w:b w:val="0"/>
+          <w:sz w:val="20"/>
+        </w:rPr>
+        <w:t>Рисунок 15 — Фильтр tls (1091 пакет)</w:t>
+      </w:r>
+    </w:p>
+    <w:p>
+      <w:pPr>
+        <w:jc w:val="center"/>
+      </w:pPr>
+      <w:r>
+        <w:drawing>
+          <wp:inline>
+            <wp:extent cx="5400000" cy="3186695"/>
+            <wp:docPr id="16" name="Picture 16"/>
+            <wp:cNvGraphicFramePr>
+              <a:graphicFrameLocks noChangeAspect="1"/>
+            </wp:cNvGraphicFramePr>
+            <a:graphic>
+              <a:graphicData uri="http://schemas.openxmlformats.org/drawingml/2006/picture">
+                <pic:pic>
+                  <pic:nvPicPr>
+                    <pic:cNvPr id="0" name="p3_flow.png"/>
+                    <pic:cNvPicPr/>
+                  </pic:nvPicPr>
+                  <pic:blipFill>
+                    <a:blip r:embed="rId23"/>
+                    <a:stretch>
+                      <a:fillRect/>
+                    </a:stretch>
+                  </pic:blipFill>
+                  <pic:spPr>
+                    <a:xfrm>
+                      <a:off x="0" y="0"/>
+                      <a:ext cx="5400000" cy="3186695"/>
+                    </a:xfrm>
+                    <a:prstGeom prst="rect"/>
+                  </pic:spPr>
+                </pic:pic>
+              </a:graphicData>
+            </a:graphic>
+          </wp:inline>
+        </w:drawing>
+      </w:r>
+    </w:p>
+    <w:p>
+      <w:pPr>
+        <w:jc w:val="center"/>
+      </w:pPr>
+      <w:r>
+        <w:rPr>
+          <w:rFonts w:ascii="Times New Roman" w:hAnsi="Times New Roman" w:eastAsia="Times New Roman"/>
+          <w:b w:val="0"/>
+          <w:sz w:val="20"/>
+        </w:rPr>
+        <w:t>Рисунок 16 — Диаграмма потока для tls</w:t>
+      </w:r>
+    </w:p>
+    <w:p>
+      <w:pPr>
+        <w:pStyle w:val="Heading2"/>
+      </w:pPr>
+      <w:r>
+        <w:t>Артефакт 7. Фильтры Wireshark (Часть 3, п. 3)</w:t>
+      </w:r>
+    </w:p>
+    <w:p>
+      <w:r>
+        <w:rPr>
+          <w:rFonts w:ascii="Times New Roman" w:hAnsi="Times New Roman" w:eastAsia="Times New Roman"/>
+          <w:b w:val="0"/>
+          <w:sz w:val="22"/>
+        </w:rPr>
+        <w:t>3.1 DNS-клиент: по адресу клиента и порту 53 по UDP и TCP, трафик DNS-сервера исключается (в фильтре клиентский адрес стоит источником с портом назначения 53 либо получателем с портом источника 53). 3.2 Все кадры, отправленные интерфейсом хоста. 3.3 Широковещательные кадры.</w:t>
+      </w:r>
+    </w:p>
+    <w:p>
+      <w:pPr>
+        <w:spacing w:after="0"/>
+      </w:pPr>
+      <w:r>
+        <w:rPr>
+          <w:rFonts w:ascii="Courier New" w:hAnsi="Courier New" w:eastAsia="Courier New"/>
+          <w:b w:val="0"/>
+          <w:sz w:val="17"/>
+        </w:rPr>
+        <w:t>(ip.src==192.168.1.22 &amp;&amp; (udp.dstport==53 || tcp.dstport==53)) || (ip.dst==192.168.1.22 &amp;&amp; (udp.srcport==53 || tcp.srcport==53))</w:t>
+      </w:r>
+    </w:p>
+    <w:p>
+      <w:pPr>
+        <w:spacing w:after="0"/>
+      </w:pPr>
+      <w:r>
+        <w:rPr>
+          <w:rFonts w:ascii="Courier New" w:hAnsi="Courier New" w:eastAsia="Courier New"/>
+          <w:b w:val="0"/>
+          <w:sz w:val="17"/>
+        </w:rPr>
+        <w:t>eth.src == e8:fb:1c:4f:61:f5</w:t>
+      </w:r>
+    </w:p>
+    <w:p>
+      <w:pPr>
+        <w:spacing w:after="0"/>
+      </w:pPr>
+      <w:r>
+        <w:rPr>
+          <w:rFonts w:ascii="Courier New" w:hAnsi="Courier New" w:eastAsia="Courier New"/>
+          <w:b w:val="0"/>
+          <w:sz w:val="17"/>
+        </w:rPr>
+        <w:t>eth.dst == ff:ff:ff:ff:ff:ff</w:t>
+      </w:r>
+    </w:p>
+    <w:p>
+      <w:pPr>
+        <w:jc w:val="center"/>
+      </w:pPr>
+      <w:r>
+        <w:drawing>
+          <wp:inline>
+            <wp:extent cx="5400000" cy="3575519"/>
+            <wp:docPr id="17" name="Picture 17"/>
+            <wp:cNvGraphicFramePr>
+              <a:graphicFrameLocks noChangeAspect="1"/>
+            </wp:cNvGraphicFramePr>
+            <a:graphic>
+              <a:graphicData uri="http://schemas.openxmlformats.org/drawingml/2006/picture">
+                <pic:pic>
+                  <pic:nvPicPr>
+                    <pic:cNvPr id="0" name="p3_dns0.png"/>
+                    <pic:cNvPicPr/>
+                  </pic:nvPicPr>
+                  <pic:blipFill>
+                    <a:blip r:embed="rId24"/>
+                    <a:stretch>
+                      <a:fillRect/>
+                    </a:stretch>
+                  </pic:blipFill>
+                  <pic:spPr>
+                    <a:xfrm>
+                      <a:off x="0" y="0"/>
+                      <a:ext cx="5400000" cy="3575519"/>
+                    </a:xfrm>
+                    <a:prstGeom prst="rect"/>
+                  </pic:spPr>
+                </pic:pic>
+              </a:graphicData>
+            </a:graphic>
+          </wp:inline>
+        </w:drawing>
+      </w:r>
+    </w:p>
+    <w:p>
+      <w:pPr>
+        <w:jc w:val="center"/>
+      </w:pPr>
+      <w:r>
+        <w:rPr>
+          <w:rFonts w:ascii="Times New Roman" w:hAnsi="Times New Roman" w:eastAsia="Times New Roman"/>
+          <w:b w:val="0"/>
+          <w:sz w:val="20"/>
+        </w:rPr>
+        <w:t>Рисунок 17 — Фильтр DNS-клиента в захвате по Wi-Fi: 0 пакетов (имена разрешаются через адаптер happ-xray)</w:t>
+      </w:r>
+    </w:p>
+    <w:p>
+      <w:pPr>
+        <w:jc w:val="center"/>
+      </w:pPr>
+      <w:r>
+        <w:drawing>
+          <wp:inline>
+            <wp:extent cx="5400000" cy="3981389"/>
+            <wp:docPr id="18" name="Picture 18"/>
+            <wp:cNvGraphicFramePr>
+              <a:graphicFrameLocks noChangeAspect="1"/>
+            </wp:cNvGraphicFramePr>
+            <a:graphic>
+              <a:graphicData uri="http://schemas.openxmlformats.org/drawingml/2006/picture">
+                <pic:pic>
+                  <pic:nvPicPr>
+                    <pic:cNvPr id="0" name="p3_dns_vpn.png"/>
+                    <pic:cNvPicPr/>
+                  </pic:nvPicPr>
+                  <pic:blipFill>
+                    <a:blip r:embed="rId25"/>
+                    <a:stretch>
+                      <a:fillRect/>
+                    </a:stretch>
+                  </pic:blipFill>
+                  <pic:spPr>
+                    <a:xfrm>
+                      <a:off x="0" y="0"/>
+                      <a:ext cx="5400000" cy="3981389"/>
+                    </a:xfrm>
+                    <a:prstGeom prst="rect"/>
+                  </pic:spPr>
+                </pic:pic>
+              </a:graphicData>
+            </a:graphic>
+          </wp:inline>
+        </w:drawing>
+      </w:r>
+    </w:p>
+    <w:p>
+      <w:pPr>
+        <w:jc w:val="center"/>
+      </w:pPr>
+      <w:r>
+        <w:rPr>
+          <w:rFonts w:ascii="Times New Roman" w:hAnsi="Times New Roman" w:eastAsia="Times New Roman"/>
+          <w:b w:val="0"/>
+          <w:sz w:val="20"/>
+        </w:rPr>
+        <w:t>Рисунок 18 — nslookup использует DNS-сервер 172.19.0.2 виртуального адаптера</w:t>
+      </w:r>
+    </w:p>
+    <w:p>
+      <w:pPr>
+        <w:jc w:val="center"/>
+      </w:pPr>
+      <w:r>
+        <w:drawing>
+          <wp:inline>
+            <wp:extent cx="5400000" cy="3926560"/>
+            <wp:docPr id="19" name="Picture 19"/>
+            <wp:cNvGraphicFramePr>
+              <a:graphicFrameLocks noChangeAspect="1"/>
+            </wp:cNvGraphicFramePr>
+            <a:graphic>
+              <a:graphicData uri="http://schemas.openxmlformats.org/drawingml/2006/picture">
+                <pic:pic>
+                  <pic:nvPicPr>
+                    <pic:cNvPr id="0" name="p3_dns.png"/>
+                    <pic:cNvPicPr/>
+                  </pic:nvPicPr>
+                  <pic:blipFill>
+                    <a:blip r:embed="rId26"/>
+                    <a:stretch>
+                      <a:fillRect/>
+                    </a:stretch>
+                  </pic:blipFill>
+                  <pic:spPr>
+                    <a:xfrm>
+                      <a:off x="0" y="0"/>
+                      <a:ext cx="5400000" cy="3926560"/>
+                    </a:xfrm>
+                    <a:prstGeom prst="rect"/>
+                  </pic:spPr>
+                </pic:pic>
+              </a:graphicData>
+            </a:graphic>
+          </wp:inline>
+        </w:drawing>
+      </w:r>
+    </w:p>
+    <w:p>
+      <w:pPr>
+        <w:jc w:val="center"/>
+      </w:pPr>
+      <w:r>
+        <w:rPr>
+          <w:rFonts w:ascii="Times New Roman" w:hAnsi="Times New Roman" w:eastAsia="Times New Roman"/>
+          <w:b w:val="0"/>
+          <w:sz w:val="20"/>
+        </w:rPr>
+        <w:t>Рисунок 19 — DNS-запросы и ответы, захват на адаптере happ-xray (фильтр dns)</w:t>
+      </w:r>
+    </w:p>
+    <w:p>
+      <w:pPr>
+        <w:jc w:val="center"/>
+      </w:pPr>
+      <w:r>
+        <w:drawing>
+          <wp:inline>
+            <wp:extent cx="5400000" cy="3575519"/>
+            <wp:docPr id="20" name="Picture 20"/>
+            <wp:cNvGraphicFramePr>
+              <a:graphicFrameLocks noChangeAspect="1"/>
+            </wp:cNvGraphicFramePr>
+            <a:graphic>
+              <a:graphicData uri="http://schemas.openxmlformats.org/drawingml/2006/picture">
+                <pic:pic>
+                  <pic:nvPicPr>
+                    <pic:cNvPr id="0" name="p3_ethsrc.png"/>
+                    <pic:cNvPicPr/>
+                  </pic:nvPicPr>
+                  <pic:blipFill>
+                    <a:blip r:embed="rId27"/>
+                    <a:stretch>
+                      <a:fillRect/>
+                    </a:stretch>
+                  </pic:blipFill>
+                  <pic:spPr>
+                    <a:xfrm>
+                      <a:off x="0" y="0"/>
+                      <a:ext cx="5400000" cy="3575519"/>
+                    </a:xfrm>
+                    <a:prstGeom prst="rect"/>
+                  </pic:spPr>
+                </pic:pic>
+              </a:graphicData>
+            </a:graphic>
+          </wp:inline>
+        </w:drawing>
+      </w:r>
+    </w:p>
+    <w:p>
+      <w:pPr>
+        <w:jc w:val="center"/>
+      </w:pPr>
+      <w:r>
+        <w:rPr>
+          <w:rFonts w:ascii="Times New Roman" w:hAnsi="Times New Roman" w:eastAsia="Times New Roman"/>
+          <w:b w:val="0"/>
+          <w:sz w:val="20"/>
+        </w:rPr>
+        <w:t>Рисунок 20 — Кадры, отправленные интерфейсом хоста: 2672 (48,0 %)</w:t>
+      </w:r>
+    </w:p>
+    <w:p>
+      <w:pPr>
+        <w:jc w:val="center"/>
+      </w:pPr>
+      <w:r>
+        <w:drawing>
+          <wp:inline>
+            <wp:extent cx="5400000" cy="3905217"/>
+            <wp:docPr id="21" name="Picture 21"/>
+            <wp:cNvGraphicFramePr>
+              <a:graphicFrameLocks noChangeAspect="1"/>
+            </wp:cNvGraphicFramePr>
+            <a:graphic>
+              <a:graphicData uri="http://schemas.openxmlformats.org/drawingml/2006/picture">
+                <pic:pic>
+                  <pic:nvPicPr>
+                    <pic:cNvPr id="0" name="p3_bcast_arp.png"/>
+                    <pic:cNvPicPr/>
+                  </pic:nvPicPr>
+                  <pic:blipFill>
+                    <a:blip r:embed="rId28"/>
+                    <a:stretch>
+                      <a:fillRect/>
+                    </a:stretch>
+                  </pic:blipFill>
+                  <pic:spPr>
+                    <a:xfrm>
+                      <a:off x="0" y="0"/>
+                      <a:ext cx="5400000" cy="3905217"/>
+                    </a:xfrm>
+                    <a:prstGeom prst="rect"/>
+                  </pic:spPr>
+                </pic:pic>
+              </a:graphicData>
+            </a:graphic>
+          </wp:inline>
+        </w:drawing>
+      </w:r>
+    </w:p>
+    <w:p>
+      <w:pPr>
+        <w:jc w:val="center"/>
+      </w:pPr>
+      <w:r>
+        <w:rPr>
+          <w:rFonts w:ascii="Times New Roman" w:hAnsi="Times New Roman" w:eastAsia="Times New Roman"/>
+          <w:b w:val="0"/>
+          <w:sz w:val="20"/>
+        </w:rPr>
+        <w:t>Рисунок 21 — Широковещательные кадры (протокол ARP)</w:t>
+      </w:r>
+    </w:p>
+    <w:p>
+      <w:pPr>
+        <w:jc w:val="center"/>
+      </w:pPr>
+      <w:r>
+        <w:drawing>
+          <wp:inline>
+            <wp:extent cx="5400000" cy="3981389"/>
+            <wp:docPr id="22" name="Picture 22"/>
+            <wp:cNvGraphicFramePr>
+              <a:graphicFrameLocks noChangeAspect="1"/>
+            </wp:cNvGraphicFramePr>
+            <a:graphic>
+              <a:graphicData uri="http://schemas.openxmlformats.org/drawingml/2006/picture">
+                <pic:pic>
+                  <pic:nvPicPr>
+                    <pic:cNvPr id="0" name="p3_bcast_sorted1.png"/>
+                    <pic:cNvPicPr/>
+                  </pic:nvPicPr>
+                  <pic:blipFill>
+                    <a:blip r:embed="rId29"/>
+                    <a:stretch>
+                      <a:fillRect/>
+                    </a:stretch>
+                  </pic:blipFill>
+                  <pic:spPr>
+                    <a:xfrm>
+                      <a:off x="0" y="0"/>
+                      <a:ext cx="5400000" cy="3981389"/>
+                    </a:xfrm>
+                    <a:prstGeom prst="rect"/>
+                  </pic:spPr>
+                </pic:pic>
+              </a:graphicData>
+            </a:graphic>
+          </wp:inline>
+        </w:drawing>
+      </w:r>
+    </w:p>
+    <w:p>
+      <w:pPr>
+        <w:jc w:val="center"/>
+      </w:pPr>
+      <w:r>
+        <w:rPr>
+          <w:rFonts w:ascii="Times New Roman" w:hAnsi="Times New Roman" w:eastAsia="Times New Roman"/>
+          <w:b w:val="0"/>
+          <w:sz w:val="20"/>
+        </w:rPr>
+        <w:t>Рисунок 22 — Широковещательные кадры (ARP и NBNS)</w:t>
+      </w:r>
+    </w:p>
+    <w:p>
+      <w:pPr>
+        <w:jc w:val="center"/>
+      </w:pPr>
+      <w:r>
+        <w:drawing>
+          <wp:inline>
+            <wp:extent cx="5400000" cy="3926560"/>
+            <wp:docPr id="23" name="Picture 23"/>
+            <wp:cNvGraphicFramePr>
+              <a:graphicFrameLocks noChangeAspect="1"/>
+            </wp:cNvGraphicFramePr>
+            <a:graphic>
+              <a:graphicData uri="http://schemas.openxmlformats.org/drawingml/2006/picture">
+                <pic:pic>
+                  <pic:nvPicPr>
+                    <pic:cNvPr id="0" name="p3_bcast3.png"/>
+                    <pic:cNvPicPr/>
+                  </pic:nvPicPr>
+                  <pic:blipFill>
+                    <a:blip r:embed="rId30"/>
+                    <a:stretch>
+                      <a:fillRect/>
+                    </a:stretch>
+                  </pic:blipFill>
+                  <pic:spPr>
+                    <a:xfrm>
+                      <a:off x="0" y="0"/>
+                      <a:ext cx="5400000" cy="3926560"/>
+                    </a:xfrm>
+                    <a:prstGeom prst="rect"/>
+                  </pic:spPr>
+                </pic:pic>
+              </a:graphicData>
+            </a:graphic>
+          </wp:inline>
+        </w:drawing>
+      </w:r>
+    </w:p>
+    <w:p>
+      <w:pPr>
+        <w:jc w:val="center"/>
+      </w:pPr>
+      <w:r>
+        <w:rPr>
+          <w:rFonts w:ascii="Times New Roman" w:hAnsi="Times New Roman" w:eastAsia="Times New Roman"/>
+          <w:b w:val="0"/>
+          <w:sz w:val="20"/>
+        </w:rPr>
+        <w:t>Рисунок 23 — Три протокола: ARP, ICMP (ping 192.168.1.255), NBNS</w:t>
+      </w:r>
+    </w:p>
+    <w:p>
+      <w:pPr>
+        <w:pStyle w:val="Heading1"/>
+      </w:pPr>
+      <w:r>
+        <w:t>Ответы на вопросы и задания</w:t>
+      </w:r>
+    </w:p>
+    <w:p>
+      <w:r>
+        <w:rPr>
+          <w:rFonts w:ascii="Times New Roman" w:hAnsi="Times New Roman" w:eastAsia="Times New Roman"/>
+          <w:b/>
+          <w:sz w:val="22"/>
+        </w:rPr>
+        <w:t>1. По какому протоколу работает утилита mtr? Как это можно определить?</w:t>
+      </w:r>
+    </w:p>
+    <w:p>
+      <w:r>
+        <w:rPr>
+          <w:rFonts w:ascii="Times New Roman" w:hAnsi="Times New Roman" w:eastAsia="Times New Roman"/>
+          <w:b w:val="0"/>
+          <w:sz w:val="22"/>
+        </w:rPr>
+        <w:t>По умолчанию mtr использует ICMP (echo request/reply, меняя TTL, как ping и traceroute). Определил перехватом: на c7-1 запустил tcpdump с фильтром icmp и mtr до www.itmo.ru; в выводе пакеты ICMP echo request и echo reply между 10.0.2.16 и адресом сайта. Режим можно менять: ключ -u — UDP, -T — TCP.</w:t>
+      </w:r>
+    </w:p>
+    <w:p>
+      <w:r>
+        <w:rPr>
+          <w:rFonts w:ascii="Times New Roman" w:hAnsi="Times New Roman" w:eastAsia="Times New Roman"/>
+          <w:b/>
+          <w:sz w:val="22"/>
+        </w:rPr>
+        <w:t>2. Опишите значения столбцов статистики, выводимой утилитой mtr. Какие еще статистики доступны в mtr кроме основных?</w:t>
+      </w:r>
+    </w:p>
+    <w:p>
+      <w:r>
+        <w:rPr>
+          <w:rFonts w:ascii="Times New Roman" w:hAnsi="Times New Roman" w:eastAsia="Times New Roman"/>
+          <w:b w:val="0"/>
+          <w:sz w:val="22"/>
+        </w:rPr>
+        <w:t>Основные столбцы: Loss% — доля потерянных пакетов на узле; Snt — число отправленных пакетов; Last — время кругового обхода последнего пакета; Avg — среднее; Best — минимальное; Wrst — максимальное; StDev — стандартное отклонение времени; HOST — адрес или имя узла маршрута. Ключ -o позволяет выбрать любые поля: L — потери, D — отброшенные, R — полученные, S — отправленные, N — последний, B — лучший, A — средний, W — худший, V — стандартное отклонение, G — среднее геометрическое, J — текущий джиттер, M — средний джиттер, X — максимальный джиттер, I — межпакетный джиттер.</w:t>
+      </w:r>
+    </w:p>
+    <w:p>
+      <w:r>
+        <w:rPr>
+          <w:rFonts w:ascii="Times New Roman" w:hAnsi="Times New Roman" w:eastAsia="Times New Roman"/>
+          <w:b/>
+          <w:sz w:val="22"/>
+        </w:rPr>
+        <w:t>3. Какие типы кадров Ethernet бывают, в чем их отличия?</w:t>
+      </w:r>
+    </w:p>
+    <w:p>
+      <w:r>
+        <w:rPr>
+          <w:rFonts w:ascii="Times New Roman" w:hAnsi="Times New Roman" w:eastAsia="Times New Roman"/>
+          <w:b w:val="0"/>
+          <w:sz w:val="22"/>
+        </w:rPr>
+        <w:t>Четыре формата: Ethernet II (DIX) — после MAC-адресов поле EtherType (значение 0x0600 и выше) определяет протокол верхнего уровня, например 0x0800 — IPv4, 0x0806 — ARP; IEEE 802.3 raw (Novell) — вместо EtherType поле длины, сразу за ним данные IPX (первые два байта 0xFFFF); IEEE 802.3 с LLC (802.2) — поле длины, затем заголовок LLC (DSAP, SSAP, управление); IEEE 802.3 с SNAP — LLC с кодами 0xAA и дополнительным заголовком SNAP (код организации и тип протокола). Отличаются полем после адресов (тип или длина) и дополнительными заголовками.</w:t>
+      </w:r>
+    </w:p>
+    <w:p>
+      <w:r>
+        <w:rPr>
+          <w:rFonts w:ascii="Times New Roman" w:hAnsi="Times New Roman" w:eastAsia="Times New Roman"/>
+          <w:b/>
+          <w:sz w:val="22"/>
+        </w:rPr>
+        <w:t>4. Какой тип кадров Ethernet используется в анализируемой сети? Почему именно его применение позволяет сети функционировать?</w:t>
+      </w:r>
+    </w:p>
+    <w:p>
+      <w:r>
+        <w:rPr>
+          <w:rFonts w:ascii="Times New Roman" w:hAnsi="Times New Roman" w:eastAsia="Times New Roman"/>
+          <w:b w:val="0"/>
+          <w:sz w:val="22"/>
+        </w:rPr>
+        <w:t>Ethernet II (в Wireshark: «Ethernet II», в нём EtherType 0x0800 для IPv4 и 0x0806 для ARP). Поле EtherType прямо указывает, какому протоколу сетевого уровня передать полезную нагрузку, без заголовка LLC. Стек TCP/IP (IP, ARP) рассчитан на такой формат: по нему получатель различает IPv4 и ARP-кадры.</w:t>
+      </w:r>
+    </w:p>
+    <w:p>
+      <w:r>
+        <w:rPr>
+          <w:rFonts w:ascii="Times New Roman" w:hAnsi="Times New Roman" w:eastAsia="Times New Roman"/>
+          <w:b/>
+          <w:sz w:val="22"/>
+        </w:rPr>
+        <w:t>5. Как можно определить тип используемого коммутационного оборудования, используя сетевую статистику? Сделайте предположения о типе коммутационного оборудования использовался в сети на основании собранного трафика.</w:t>
+      </w:r>
+    </w:p>
+    <w:p>
+      <w:r>
+        <w:rPr>
+          <w:rFonts w:ascii="Times New Roman" w:hAnsi="Times New Roman" w:eastAsia="Times New Roman"/>
+          <w:b w:val="0"/>
+          <w:sz w:val="22"/>
+        </w:rPr>
+        <w:t>Концентратор (хаб) повторяет каждый кадр на все порты, поэтому в захвате были бы чужие одноадресные кадры других узлов. Коммутатор передаёт одноадресные кадры только на порт получателя, а на остальные порты идут лишь широковещательные и многоадресные. Маршрутизатор подключён, если в трафике во внешние сети адресат кадра — MAC самого маршрутизатора. В статистике Ethernet три адреса: широковещательный, мой (e8:fb:1c:4f:61:f5) и 38:d5:47:41:88:34 (ASUSTek, маршрутизатор). Трафика других узлов нет, а весь внешний трафик (например, к 187.7.207.194) идёт на MAC 38:d5:47:41:88:34. Вывод: хост подключён к устройству уровня коммутатора с маршрутизацией (домашний Wi-Fi-маршрутизатор с точкой доступа), не к хабу. Ограничение: в Wi-Fi без режима монитора чужие кадры недоступны на уровне драйвера, поэтому вывод косвенный.</w:t>
+      </w:r>
+    </w:p>
+    <w:p>
+      <w:r>
+        <w:rPr>
+          <w:rFonts w:ascii="Times New Roman" w:hAnsi="Times New Roman" w:eastAsia="Times New Roman"/>
+          <w:b/>
+          <w:sz w:val="22"/>
+        </w:rPr>
+        <w:t>6. На какие адреса сетевого уровня осуществляются широковещательные рассылки?</w:t>
+      </w:r>
+    </w:p>
+    <w:p>
+      <w:r>
+        <w:rPr>
+          <w:rFonts w:ascii="Times New Roman" w:hAnsi="Times New Roman" w:eastAsia="Times New Roman"/>
+          <w:b w:val="0"/>
+          <w:sz w:val="22"/>
+        </w:rPr>
+        <w:t>На ограниченный широковещательный адрес 255.255.255.255 и на широковещательный адрес подсети (направленный) — в моей сети 192.168.1.255 (запросы NBNS и ICMP-запросы ping 192.168.1.255). ARP-запросы адреса сетевого уровня получателя не используют: в них указан искомый IP-адрес (Who has 192.168.1.240?).</w:t>
+      </w:r>
+    </w:p>
+    <w:p>
+      <w:r>
+        <w:rPr>
+          <w:rFonts w:ascii="Times New Roman" w:hAnsi="Times New Roman" w:eastAsia="Times New Roman"/>
+          <w:b/>
+          <w:sz w:val="22"/>
+        </w:rPr>
+        <w:t>7. На какой канальный адрес осуществляются широковещательные рассылки?</w:t>
+      </w:r>
+    </w:p>
+    <w:p>
+      <w:r>
+        <w:rPr>
+          <w:rFonts w:ascii="Times New Roman" w:hAnsi="Times New Roman" w:eastAsia="Times New Roman"/>
+          <w:b w:val="0"/>
+          <w:sz w:val="22"/>
+        </w:rPr>
+        <w:t>На MAC-адрес ff:ff:ff:ff:ff:ff (все биты равны единице). Кадр получают все узлы сегмента.</w:t>
+      </w:r>
+    </w:p>
+    <w:p>
+      <w:r>
+        <w:rPr>
+          <w:rFonts w:ascii="Times New Roman" w:hAnsi="Times New Roman" w:eastAsia="Times New Roman"/>
+          <w:b/>
+          <w:sz w:val="22"/>
+        </w:rPr>
+        <w:t>8. Для чего применяются перехваченные широковещательные рассылки в Части 3?</w:t>
+      </w:r>
+    </w:p>
+    <w:p>
+      <w:r>
+        <w:rPr>
+          <w:rFonts w:ascii="Times New Roman" w:hAnsi="Times New Roman" w:eastAsia="Times New Roman"/>
+          <w:b w:val="0"/>
+          <w:sz w:val="22"/>
+        </w:rPr>
+        <w:t>ARP-запрос (Who has 192.168.1.240? Tell 192.168.1.22) — определение MAC-адреса по IP-адресу в локальной сети; NBNS (Name query NB WORKGROUP&lt;1c&gt;) — запрос службы имён NetBIOS поверх UDP, определяет адреса узлов группы WORKGROUP; ICMP echo request на 192.168.1.255 — мой тест (ping широковещательного адреса, ответов не было).</w:t>
       </w:r>
     </w:p>
     <w:sectPr>

</xml_diff>

<commit_message>
Lab 3: Part 4 traceroute
Co-Authored-By: Claude Sonnet 5.5 <noreply@anthropic.com>
Claude-Session: https://claude.ai/code/session_01AxRBWGkpGe1tM1Y5SaPo4g
</commit_message>
<xml_diff>
--- a/lab3/lab-3_report.docx
+++ b/lab3/lab-3_report.docx
@@ -461,6 +461,37 @@
           <w:sz w:val="22"/>
         </w:rPr>
         <w:t>5. Определил тип оборудования по MAC-адресам: в захвате только адрес компьютера, адрес шлюза (маршрутизатора) 38:d5:47:41:88:34 и широковещательный адрес.</w:t>
+      </w:r>
+    </w:p>
+    <w:p/>
+    <w:p>
+      <w:r>
+        <w:rPr>
+          <w:rFonts w:ascii="Times New Roman" w:hAnsi="Times New Roman" w:eastAsia="Times New Roman"/>
+          <w:b/>
+          <w:sz w:val="24"/>
+        </w:rPr>
+        <w:t>Часть 4. Определение маршрута прохождения пакета</w:t>
+      </w:r>
+    </w:p>
+    <w:p>
+      <w:r>
+        <w:rPr>
+          <w:rFonts w:ascii="Times New Roman" w:hAnsi="Times New Roman" w:eastAsia="Times New Roman"/>
+          <w:b w:val="0"/>
+          <w:sz w:val="22"/>
+        </w:rPr>
+        <w:t>1. Изучил ключи traceroute: -I (ICMP), -U (UDP), -T (TCP), -F (запрет фрагментации, бит DF), последний аргумент задаёт размер пакета.</w:t>
+      </w:r>
+    </w:p>
+    <w:p>
+      <w:r>
+        <w:rPr>
+          <w:rFonts w:ascii="Times New Roman" w:hAnsi="Times New Roman" w:eastAsia="Times New Roman"/>
+          <w:b w:val="0"/>
+          <w:sz w:val="22"/>
+        </w:rPr>
+        <w:t>2. На c7-1 определил маршрут до 8.8.8.8 тремя способами (ICMP, UDP, TCP) и проверил фрагментацию пакетами разного размера с установленным битом DF (1400, 1500 и 1600 байт).</w:t>
       </w:r>
     </w:p>
     <w:p/>
@@ -1983,6 +2014,362 @@
     </w:p>
     <w:p>
       <w:pPr>
+        <w:pStyle w:val="Heading2"/>
+      </w:pPr>
+      <w:r>
+        <w:t>Артефакт 8. Команды и вывод traceroute (Часть 4, п. 2)</w:t>
+      </w:r>
+    </w:p>
+    <w:p>
+      <w:r>
+        <w:rPr>
+          <w:rFonts w:ascii="Times New Roman" w:hAnsi="Times New Roman" w:eastAsia="Times New Roman"/>
+          <w:b w:val="0"/>
+          <w:sz w:val="22"/>
+        </w:rPr>
+        <w:t>c7-1, Debian 11, адрес 10.0.2.16 за NAT VirtualBox (шлюз 10.0.2.1). ICMP: 8.8.8.8 отвечает на первом шаге. UDP: отвечает только шлюз, на шагах 2–30 ответов нет (на рисунке шаги 24–30 такие же). TCP: 8.8.8.8 отвечает на первом шаге. Фрагментация: пакет 1400 байт проходит, пакеты 1500 байт с битом DF не получают ответа на всех 30 шагах, на 1600 байт получена ошибка !F-1500 (нужна фрагментация, MTU 1500).</w:t>
+      </w:r>
+    </w:p>
+    <w:p>
+      <w:pPr>
+        <w:spacing w:after="0"/>
+      </w:pPr>
+      <w:r>
+        <w:rPr>
+          <w:rFonts w:ascii="Courier New" w:hAnsi="Courier New" w:eastAsia="Courier New"/>
+          <w:b w:val="0"/>
+          <w:sz w:val="17"/>
+        </w:rPr>
+        <w:t>traceroute -I 8.8.8.8</w:t>
+      </w:r>
+    </w:p>
+    <w:p>
+      <w:pPr>
+        <w:spacing w:after="0"/>
+      </w:pPr>
+      <w:r>
+        <w:rPr>
+          <w:rFonts w:ascii="Courier New" w:hAnsi="Courier New" w:eastAsia="Courier New"/>
+          <w:b w:val="0"/>
+          <w:sz w:val="17"/>
+        </w:rPr>
+        <w:t>traceroute -U 8.8.8.8</w:t>
+      </w:r>
+    </w:p>
+    <w:p>
+      <w:pPr>
+        <w:spacing w:after="0"/>
+      </w:pPr>
+      <w:r>
+        <w:rPr>
+          <w:rFonts w:ascii="Courier New" w:hAnsi="Courier New" w:eastAsia="Courier New"/>
+          <w:b w:val="0"/>
+          <w:sz w:val="17"/>
+        </w:rPr>
+        <w:t>traceroute -T 8.8.8.8</w:t>
+      </w:r>
+    </w:p>
+    <w:p>
+      <w:pPr>
+        <w:spacing w:after="0"/>
+      </w:pPr>
+      <w:r>
+        <w:rPr>
+          <w:rFonts w:ascii="Courier New" w:hAnsi="Courier New" w:eastAsia="Courier New"/>
+          <w:b w:val="0"/>
+          <w:sz w:val="17"/>
+        </w:rPr>
+        <w:t>traceroute -I -F 8.8.8.8 1400</w:t>
+      </w:r>
+    </w:p>
+    <w:p>
+      <w:pPr>
+        <w:spacing w:after="0"/>
+      </w:pPr>
+      <w:r>
+        <w:rPr>
+          <w:rFonts w:ascii="Courier New" w:hAnsi="Courier New" w:eastAsia="Courier New"/>
+          <w:b w:val="0"/>
+          <w:sz w:val="17"/>
+        </w:rPr>
+        <w:t>traceroute -I -F 8.8.8.8 1500</w:t>
+      </w:r>
+    </w:p>
+    <w:p>
+      <w:pPr>
+        <w:spacing w:after="0"/>
+      </w:pPr>
+      <w:r>
+        <w:rPr>
+          <w:rFonts w:ascii="Courier New" w:hAnsi="Courier New" w:eastAsia="Courier New"/>
+          <w:b w:val="0"/>
+          <w:sz w:val="17"/>
+        </w:rPr>
+        <w:t>traceroute -I -F 8.8.8.8 1600</w:t>
+      </w:r>
+    </w:p>
+    <w:p>
+      <w:pPr>
+        <w:jc w:val="center"/>
+      </w:pPr>
+      <w:r>
+        <w:drawing>
+          <wp:inline>
+            <wp:extent cx="5400000" cy="367500"/>
+            <wp:docPr id="24" name="Picture 24"/>
+            <wp:cNvGraphicFramePr>
+              <a:graphicFrameLocks noChangeAspect="1"/>
+            </wp:cNvGraphicFramePr>
+            <a:graphic>
+              <a:graphicData uri="http://schemas.openxmlformats.org/drawingml/2006/picture">
+                <pic:pic>
+                  <pic:nvPicPr>
+                    <pic:cNvPr id="0" name="p4_icmp.png"/>
+                    <pic:cNvPicPr/>
+                  </pic:nvPicPr>
+                  <pic:blipFill>
+                    <a:blip r:embed="rId31"/>
+                    <a:stretch>
+                      <a:fillRect/>
+                    </a:stretch>
+                  </pic:blipFill>
+                  <pic:spPr>
+                    <a:xfrm>
+                      <a:off x="0" y="0"/>
+                      <a:ext cx="5400000" cy="367500"/>
+                    </a:xfrm>
+                    <a:prstGeom prst="rect"/>
+                  </pic:spPr>
+                </pic:pic>
+              </a:graphicData>
+            </a:graphic>
+          </wp:inline>
+        </w:drawing>
+      </w:r>
+    </w:p>
+    <w:p>
+      <w:pPr>
+        <w:jc w:val="center"/>
+      </w:pPr>
+      <w:r>
+        <w:rPr>
+          <w:rFonts w:ascii="Times New Roman" w:hAnsi="Times New Roman" w:eastAsia="Times New Roman"/>
+          <w:b w:val="0"/>
+          <w:sz w:val="20"/>
+        </w:rPr>
+        <w:t>Рисунок 24 — traceroute -I 8.8.8.8</w:t>
+      </w:r>
+    </w:p>
+    <w:p>
+      <w:pPr>
+        <w:jc w:val="center"/>
+      </w:pPr>
+      <w:r>
+        <w:drawing>
+          <wp:inline>
+            <wp:extent cx="5400000" cy="3022500"/>
+            <wp:docPr id="25" name="Picture 25"/>
+            <wp:cNvGraphicFramePr>
+              <a:graphicFrameLocks noChangeAspect="1"/>
+            </wp:cNvGraphicFramePr>
+            <a:graphic>
+              <a:graphicData uri="http://schemas.openxmlformats.org/drawingml/2006/picture">
+                <pic:pic>
+                  <pic:nvPicPr>
+                    <pic:cNvPr id="0" name="p4_udp.png"/>
+                    <pic:cNvPicPr/>
+                  </pic:nvPicPr>
+                  <pic:blipFill>
+                    <a:blip r:embed="rId32"/>
+                    <a:stretch>
+                      <a:fillRect/>
+                    </a:stretch>
+                  </pic:blipFill>
+                  <pic:spPr>
+                    <a:xfrm>
+                      <a:off x="0" y="0"/>
+                      <a:ext cx="5400000" cy="3022500"/>
+                    </a:xfrm>
+                    <a:prstGeom prst="rect"/>
+                  </pic:spPr>
+                </pic:pic>
+              </a:graphicData>
+            </a:graphic>
+          </wp:inline>
+        </w:drawing>
+      </w:r>
+    </w:p>
+    <w:p>
+      <w:pPr>
+        <w:jc w:val="center"/>
+      </w:pPr>
+      <w:r>
+        <w:rPr>
+          <w:rFonts w:ascii="Times New Roman" w:hAnsi="Times New Roman" w:eastAsia="Times New Roman"/>
+          <w:b w:val="0"/>
+          <w:sz w:val="20"/>
+        </w:rPr>
+        <w:t>Рисунок 25 — traceroute -U 8.8.8.8</w:t>
+      </w:r>
+    </w:p>
+    <w:p>
+      <w:pPr>
+        <w:jc w:val="center"/>
+      </w:pPr>
+      <w:r>
+        <w:drawing>
+          <wp:inline>
+            <wp:extent cx="5400000" cy="367500"/>
+            <wp:docPr id="26" name="Picture 26"/>
+            <wp:cNvGraphicFramePr>
+              <a:graphicFrameLocks noChangeAspect="1"/>
+            </wp:cNvGraphicFramePr>
+            <a:graphic>
+              <a:graphicData uri="http://schemas.openxmlformats.org/drawingml/2006/picture">
+                <pic:pic>
+                  <pic:nvPicPr>
+                    <pic:cNvPr id="0" name="p4_tcp.png"/>
+                    <pic:cNvPicPr/>
+                  </pic:nvPicPr>
+                  <pic:blipFill>
+                    <a:blip r:embed="rId33"/>
+                    <a:stretch>
+                      <a:fillRect/>
+                    </a:stretch>
+                  </pic:blipFill>
+                  <pic:spPr>
+                    <a:xfrm>
+                      <a:off x="0" y="0"/>
+                      <a:ext cx="5400000" cy="367500"/>
+                    </a:xfrm>
+                    <a:prstGeom prst="rect"/>
+                  </pic:spPr>
+                </pic:pic>
+              </a:graphicData>
+            </a:graphic>
+          </wp:inline>
+        </w:drawing>
+      </w:r>
+    </w:p>
+    <w:p>
+      <w:pPr>
+        <w:jc w:val="center"/>
+      </w:pPr>
+      <w:r>
+        <w:rPr>
+          <w:rFonts w:ascii="Times New Roman" w:hAnsi="Times New Roman" w:eastAsia="Times New Roman"/>
+          <w:b w:val="0"/>
+          <w:sz w:val="20"/>
+        </w:rPr>
+        <w:t>Рисунок 26 — traceroute -T 8.8.8.8</w:t>
+      </w:r>
+    </w:p>
+    <w:p>
+      <w:pPr>
+        <w:jc w:val="center"/>
+      </w:pPr>
+      <w:r>
+        <w:drawing>
+          <wp:inline>
+            <wp:extent cx="5400000" cy="982500"/>
+            <wp:docPr id="27" name="Picture 27"/>
+            <wp:cNvGraphicFramePr>
+              <a:graphicFrameLocks noChangeAspect="1"/>
+            </wp:cNvGraphicFramePr>
+            <a:graphic>
+              <a:graphicData uri="http://schemas.openxmlformats.org/drawingml/2006/picture">
+                <pic:pic>
+                  <pic:nvPicPr>
+                    <pic:cNvPr id="0" name="p4_f1500.png"/>
+                    <pic:cNvPicPr/>
+                  </pic:nvPicPr>
+                  <pic:blipFill>
+                    <a:blip r:embed="rId34"/>
+                    <a:stretch>
+                      <a:fillRect/>
+                    </a:stretch>
+                  </pic:blipFill>
+                  <pic:spPr>
+                    <a:xfrm>
+                      <a:off x="0" y="0"/>
+                      <a:ext cx="5400000" cy="982500"/>
+                    </a:xfrm>
+                    <a:prstGeom prst="rect"/>
+                  </pic:spPr>
+                </pic:pic>
+              </a:graphicData>
+            </a:graphic>
+          </wp:inline>
+        </w:drawing>
+      </w:r>
+    </w:p>
+    <w:p>
+      <w:pPr>
+        <w:jc w:val="center"/>
+      </w:pPr>
+      <w:r>
+        <w:rPr>
+          <w:rFonts w:ascii="Times New Roman" w:hAnsi="Times New Roman" w:eastAsia="Times New Roman"/>
+          <w:b w:val="0"/>
+          <w:sz w:val="20"/>
+        </w:rPr>
+        <w:t>Рисунок 27 — traceroute -I -F 8.8.8.8 1500 (все 30 шагов без ответа)</w:t>
+      </w:r>
+    </w:p>
+    <w:p>
+      <w:pPr>
+        <w:jc w:val="center"/>
+      </w:pPr>
+      <w:r>
+        <w:drawing>
+          <wp:inline>
+            <wp:extent cx="5400000" cy="840000"/>
+            <wp:docPr id="28" name="Picture 28"/>
+            <wp:cNvGraphicFramePr>
+              <a:graphicFrameLocks noChangeAspect="1"/>
+            </wp:cNvGraphicFramePr>
+            <a:graphic>
+              <a:graphicData uri="http://schemas.openxmlformats.org/drawingml/2006/picture">
+                <pic:pic>
+                  <pic:nvPicPr>
+                    <pic:cNvPr id="0" name="p4_f1400_1600.png"/>
+                    <pic:cNvPicPr/>
+                  </pic:nvPicPr>
+                  <pic:blipFill>
+                    <a:blip r:embed="rId35"/>
+                    <a:stretch>
+                      <a:fillRect/>
+                    </a:stretch>
+                  </pic:blipFill>
+                  <pic:spPr>
+                    <a:xfrm>
+                      <a:off x="0" y="0"/>
+                      <a:ext cx="5400000" cy="840000"/>
+                    </a:xfrm>
+                    <a:prstGeom prst="rect"/>
+                  </pic:spPr>
+                </pic:pic>
+              </a:graphicData>
+            </a:graphic>
+          </wp:inline>
+        </w:drawing>
+      </w:r>
+    </w:p>
+    <w:p>
+      <w:pPr>
+        <w:jc w:val="center"/>
+      </w:pPr>
+      <w:r>
+        <w:rPr>
+          <w:rFonts w:ascii="Times New Roman" w:hAnsi="Times New Roman" w:eastAsia="Times New Roman"/>
+          <w:b w:val="0"/>
+          <w:sz w:val="20"/>
+        </w:rPr>
+        <w:t>Рисунок 28 — Размеры 1400 и 1600 байт с запретом фрагментации</w:t>
+      </w:r>
+    </w:p>
+    <w:p>
+      <w:pPr>
         <w:pStyle w:val="Heading1"/>
       </w:pPr>
       <w:r>
@@ -2147,6 +2534,26 @@
           <w:sz w:val="22"/>
         </w:rPr>
         <w:t>ARP-запрос (Who has 192.168.1.240? Tell 192.168.1.22) — определение MAC-адреса по IP-адресу в локальной сети; NBNS (Name query NB WORKGROUP&lt;1c&gt;) — запрос службы имён NetBIOS поверх UDP, определяет адреса узлов группы WORKGROUP; ICMP echo request на 192.168.1.255 — мой тест (ping широковещательного адреса, ответов не было).</w:t>
+      </w:r>
+    </w:p>
+    <w:p>
+      <w:r>
+        <w:rPr>
+          <w:rFonts w:ascii="Times New Roman" w:hAnsi="Times New Roman" w:eastAsia="Times New Roman"/>
+          <w:b/>
+          <w:sz w:val="22"/>
+        </w:rPr>
+        <w:t>9. В Части 4 при разном использовании утилиты traceroute вы получили разные данные. Почему?</w:t>
+      </w:r>
+    </w:p>
+    <w:p>
+      <w:r>
+        <w:rPr>
+          <w:rFonts w:ascii="Times New Roman" w:hAnsi="Times New Roman" w:eastAsia="Times New Roman"/>
+          <w:b w:val="0"/>
+          <w:sz w:val="22"/>
+        </w:rPr>
+        <w:t>traceroute наращивает TTL и ждёт ответ ICMP Time Exceeded от каждого маршрутизатора, но тип зондирующих пакетов у режимов разный (ICMP echo, UDP на высокие порты, TCP SYN), и устройства по пути их обрабатывают по-разному. Моя виртуальная машина за NAT VirtualBox: NAT-устройство не пересылает наружу пакеты с малым TTL, а само принимает соединение и отвечает от имени адресата. Поэтому для ICMP и TCP узел 8.8.8.8 ответил уже на первом шаге (NAT завершает такой обмен самостоятельно), для UDP ответил только шлюз 10.0.2.1, а на остальных шагах ответов нет — NAT не транслирует ICMP Time Exceeded для UDP-проб. Дополнительно межсетевые экраны часто отбрасывают UDP и ICMP. С запретом фрагментации (DF): пакет 1400 байт проходит, пакет 1500 байт теряется на всех шагах (с заголовком NAT превышает допустимое), а 1600 байт больше MTU интерфейса 1500 и возвращает ошибку !F-1500: узел сообщает, что фрагментация необходима, а запрещена. Фрагментация по маршруту, таким образом, не используется при DF, и MTU пути равен 1500 или меньше.</w:t>
       </w:r>
     </w:p>
     <w:sectPr>

</xml_diff>

<commit_message>
Lab 3: Part 5 bmon with flood ping
Co-Authored-By: Claude Sonnet 5.5 <noreply@anthropic.com>
Claude-Session: https://claude.ai/code/session_01AxRBWGkpGe1tM1Y5SaPo4g
</commit_message>
<xml_diff>
--- a/lab3/lab-3_report.docx
+++ b/lab3/lab-3_report.docx
@@ -492,6 +492,47 @@
           <w:sz w:val="22"/>
         </w:rPr>
         <w:t>2. На c7-1 определил маршрут до 8.8.8.8 тремя способами (ICMP, UDP, TCP) и проверил фрагментацию пакетами разного размера с установленным битом DF (1400, 1500 и 1600 байт).</w:t>
+      </w:r>
+    </w:p>
+    <w:p/>
+    <w:p>
+      <w:r>
+        <w:rPr>
+          <w:rFonts w:ascii="Times New Roman" w:hAnsi="Times New Roman" w:eastAsia="Times New Roman"/>
+          <w:b/>
+          <w:sz w:val="24"/>
+        </w:rPr>
+        <w:t>Часть 5. Текущий мониторинг сетевых интерфейсов</w:t>
+      </w:r>
+    </w:p>
+    <w:p>
+      <w:r>
+        <w:rPr>
+          <w:rFonts w:ascii="Times New Roman" w:hAnsi="Times New Roman" w:eastAsia="Times New Roman"/>
+          <w:b w:val="0"/>
+          <w:sz w:val="22"/>
+        </w:rPr>
+        <w:t>1. С хоста c7-2 запустил ping в режиме flood на внутренний интерфейс c7-1 (10.0.2.16).</w:t>
+      </w:r>
+    </w:p>
+    <w:p>
+      <w:r>
+        <w:rPr>
+          <w:rFonts w:ascii="Times New Roman" w:hAnsi="Times New Roman" w:eastAsia="Times New Roman"/>
+          <w:b w:val="0"/>
+          <w:sz w:val="22"/>
+        </w:rPr>
+        <w:t>2. На c7-1 запустил bmon на интерфейсе enp0s3 и получил загрузку: при размере данных по умолчанию (56 байт) около 262 КиБ/с и 2,74 тыс. пакетов в секунду.</w:t>
+      </w:r>
+    </w:p>
+    <w:p>
+      <w:r>
+        <w:rPr>
+          <w:rFonts w:ascii="Times New Roman" w:hAnsi="Times New Roman" w:eastAsia="Times New Roman"/>
+          <w:b w:val="0"/>
+          <w:sz w:val="22"/>
+        </w:rPr>
+        <w:t>3. Менял размер пакета ping от 100 до 60100 байт с шагом 10000 и фиксировал в bmon скорость приёма (RX) и число пакетов в секунду. Скорость выросла со 382 КиБ/с до 9,6 МиБ/с, число пакетов в секунду — с 2,75 до 6,7 тысяч (см. таблицу).</w:t>
       </w:r>
     </w:p>
     <w:p/>
@@ -2370,6 +2411,679 @@
     </w:p>
     <w:p>
       <w:pPr>
+        <w:pStyle w:val="Heading2"/>
+      </w:pPr>
+      <w:r>
+        <w:t>Артефакт 9. bmon при flood-ping (Часть 5, п. 2–3)</w:t>
+      </w:r>
+    </w:p>
+    <w:p>
+      <w:r>
+        <w:rPr>
+          <w:rFonts w:ascii="Times New Roman" w:hAnsi="Times New Roman" w:eastAsia="Times New Roman"/>
+          <w:b w:val="0"/>
+          <w:sz w:val="22"/>
+        </w:rPr>
+        <w:t>На c7-2 выполнялся ping -f на 10.0.2.16, на c7-1 запущен bmon -p enp0s3. Загрузка интерфейса enp0s3 (приём, RX) при разных размерах:</w:t>
+      </w:r>
+    </w:p>
+    <w:p>
+      <w:pPr>
+        <w:spacing w:after="0"/>
+      </w:pPr>
+      <w:r>
+        <w:rPr>
+          <w:rFonts w:ascii="Courier New" w:hAnsi="Courier New" w:eastAsia="Courier New"/>
+          <w:b w:val="0"/>
+          <w:sz w:val="17"/>
+        </w:rPr>
+        <w:t>c7-1: bmon -p enp0s3</w:t>
+      </w:r>
+    </w:p>
+    <w:p>
+      <w:pPr>
+        <w:spacing w:after="0"/>
+      </w:pPr>
+      <w:r>
+        <w:rPr>
+          <w:rFonts w:ascii="Courier New" w:hAnsi="Courier New" w:eastAsia="Courier New"/>
+          <w:b w:val="0"/>
+          <w:sz w:val="17"/>
+        </w:rPr>
+        <w:t>c7-2: ping -f 10.0.2.16</w:t>
+      </w:r>
+    </w:p>
+    <w:p>
+      <w:pPr>
+        <w:spacing w:after="0"/>
+      </w:pPr>
+      <w:r>
+        <w:rPr>
+          <w:rFonts w:ascii="Courier New" w:hAnsi="Courier New" w:eastAsia="Courier New"/>
+          <w:b w:val="0"/>
+          <w:sz w:val="17"/>
+        </w:rPr>
+        <w:t>c7-2: ping -f -s 100 10.0.2.16</w:t>
+      </w:r>
+    </w:p>
+    <w:p>
+      <w:pPr>
+        <w:spacing w:after="0"/>
+      </w:pPr>
+      <w:r>
+        <w:rPr>
+          <w:rFonts w:ascii="Courier New" w:hAnsi="Courier New" w:eastAsia="Courier New"/>
+          <w:b w:val="0"/>
+          <w:sz w:val="17"/>
+        </w:rPr>
+        <w:t>c7-2: ping -f -s 10100 10.0.2.16</w:t>
+      </w:r>
+    </w:p>
+    <w:p>
+      <w:pPr>
+        <w:spacing w:after="0"/>
+      </w:pPr>
+      <w:r>
+        <w:rPr>
+          <w:rFonts w:ascii="Courier New" w:hAnsi="Courier New" w:eastAsia="Courier New"/>
+          <w:b w:val="0"/>
+          <w:sz w:val="17"/>
+        </w:rPr>
+        <w:t>c7-2: ping -f -s 20100 10.0.2.16</w:t>
+      </w:r>
+    </w:p>
+    <w:p>
+      <w:pPr>
+        <w:spacing w:after="0"/>
+      </w:pPr>
+      <w:r>
+        <w:rPr>
+          <w:rFonts w:ascii="Courier New" w:hAnsi="Courier New" w:eastAsia="Courier New"/>
+          <w:b w:val="0"/>
+          <w:sz w:val="17"/>
+        </w:rPr>
+        <w:t>c7-2: ping -f -s 30100 10.0.2.16</w:t>
+      </w:r>
+    </w:p>
+    <w:p>
+      <w:pPr>
+        <w:spacing w:after="0"/>
+      </w:pPr>
+      <w:r>
+        <w:rPr>
+          <w:rFonts w:ascii="Courier New" w:hAnsi="Courier New" w:eastAsia="Courier New"/>
+          <w:b w:val="0"/>
+          <w:sz w:val="17"/>
+        </w:rPr>
+        <w:t>c7-2: ping -f -s 40100 10.0.2.16</w:t>
+      </w:r>
+    </w:p>
+    <w:p>
+      <w:pPr>
+        <w:spacing w:after="0"/>
+      </w:pPr>
+      <w:r>
+        <w:rPr>
+          <w:rFonts w:ascii="Courier New" w:hAnsi="Courier New" w:eastAsia="Courier New"/>
+          <w:b w:val="0"/>
+          <w:sz w:val="17"/>
+        </w:rPr>
+        <w:t>c7-2: ping -f -s 50100 10.0.2.16</w:t>
+      </w:r>
+    </w:p>
+    <w:p>
+      <w:pPr>
+        <w:spacing w:after="0"/>
+      </w:pPr>
+      <w:r>
+        <w:rPr>
+          <w:rFonts w:ascii="Courier New" w:hAnsi="Courier New" w:eastAsia="Courier New"/>
+          <w:b w:val="0"/>
+          <w:sz w:val="17"/>
+        </w:rPr>
+        <w:t>c7-2: ping -f -s 60100 10.0.2.16</w:t>
+      </w:r>
+    </w:p>
+    <w:p>
+      <w:pPr>
+        <w:spacing w:after="0"/>
+      </w:pPr>
+    </w:p>
+    <w:p>
+      <w:pPr>
+        <w:spacing w:after="0"/>
+      </w:pPr>
+      <w:r>
+        <w:rPr>
+          <w:rFonts w:ascii="Courier New" w:hAnsi="Courier New" w:eastAsia="Courier New"/>
+          <w:b w:val="0"/>
+          <w:sz w:val="17"/>
+        </w:rPr>
+        <w:t>Размер данных ping, байт | RX, скорость | RX, пакетов/с</w:t>
+      </w:r>
+    </w:p>
+    <w:p>
+      <w:pPr>
+        <w:spacing w:after="0"/>
+      </w:pPr>
+      <w:r>
+        <w:rPr>
+          <w:rFonts w:ascii="Courier New" w:hAnsi="Courier New" w:eastAsia="Courier New"/>
+          <w:b w:val="0"/>
+          <w:sz w:val="17"/>
+        </w:rPr>
+        <w:t>56 (по умолчанию) | 262 КиБ/с | 2,74 K</w:t>
+      </w:r>
+    </w:p>
+    <w:p>
+      <w:pPr>
+        <w:spacing w:after="0"/>
+      </w:pPr>
+      <w:r>
+        <w:rPr>
+          <w:rFonts w:ascii="Courier New" w:hAnsi="Courier New" w:eastAsia="Courier New"/>
+          <w:b w:val="0"/>
+          <w:sz w:val="17"/>
+        </w:rPr>
+        <w:t>100 | 382 КиБ/с | 2,75 K</w:t>
+      </w:r>
+    </w:p>
+    <w:p>
+      <w:pPr>
+        <w:spacing w:after="0"/>
+      </w:pPr>
+      <w:r>
+        <w:rPr>
+          <w:rFonts w:ascii="Courier New" w:hAnsi="Courier New" w:eastAsia="Courier New"/>
+          <w:b w:val="0"/>
+          <w:sz w:val="17"/>
+        </w:rPr>
+        <w:t>10100 | 7,43 МиБ/с | 5,27 K</w:t>
+      </w:r>
+    </w:p>
+    <w:p>
+      <w:pPr>
+        <w:spacing w:after="0"/>
+      </w:pPr>
+      <w:r>
+        <w:rPr>
+          <w:rFonts w:ascii="Courier New" w:hAnsi="Courier New" w:eastAsia="Courier New"/>
+          <w:b w:val="0"/>
+          <w:sz w:val="17"/>
+        </w:rPr>
+        <w:t>20100 | 8,37 МиБ/с | 5,97 K</w:t>
+      </w:r>
+    </w:p>
+    <w:p>
+      <w:pPr>
+        <w:spacing w:after="0"/>
+      </w:pPr>
+      <w:r>
+        <w:rPr>
+          <w:rFonts w:ascii="Courier New" w:hAnsi="Courier New" w:eastAsia="Courier New"/>
+          <w:b w:val="0"/>
+          <w:sz w:val="17"/>
+        </w:rPr>
+        <w:t>30100 | 8,73 МиБ/с | 6,24 K</w:t>
+      </w:r>
+    </w:p>
+    <w:p>
+      <w:pPr>
+        <w:spacing w:after="0"/>
+      </w:pPr>
+      <w:r>
+        <w:rPr>
+          <w:rFonts w:ascii="Courier New" w:hAnsi="Courier New" w:eastAsia="Courier New"/>
+          <w:b w:val="0"/>
+          <w:sz w:val="17"/>
+        </w:rPr>
+        <w:t>40100 | 9,13 МиБ/с | 6,53 K</w:t>
+      </w:r>
+    </w:p>
+    <w:p>
+      <w:pPr>
+        <w:spacing w:after="0"/>
+      </w:pPr>
+      <w:r>
+        <w:rPr>
+          <w:rFonts w:ascii="Courier New" w:hAnsi="Courier New" w:eastAsia="Courier New"/>
+          <w:b w:val="0"/>
+          <w:sz w:val="17"/>
+        </w:rPr>
+        <w:t>50100 | 9,62 МиБ/с | 6,69 K</w:t>
+      </w:r>
+    </w:p>
+    <w:p>
+      <w:pPr>
+        <w:spacing w:after="0"/>
+      </w:pPr>
+      <w:r>
+        <w:rPr>
+          <w:rFonts w:ascii="Courier New" w:hAnsi="Courier New" w:eastAsia="Courier New"/>
+          <w:b w:val="0"/>
+          <w:sz w:val="17"/>
+        </w:rPr>
+        <w:t>60100 | 9,60 МиБ/с | 6,71 K</w:t>
+      </w:r>
+    </w:p>
+    <w:p>
+      <w:pPr>
+        <w:jc w:val="center"/>
+      </w:pPr>
+      <w:r>
+        <w:drawing>
+          <wp:inline>
+            <wp:extent cx="5400000" cy="5250000"/>
+            <wp:docPr id="29" name="Picture 29"/>
+            <wp:cNvGraphicFramePr>
+              <a:graphicFrameLocks noChangeAspect="1"/>
+            </wp:cNvGraphicFramePr>
+            <a:graphic>
+              <a:graphicData uri="http://schemas.openxmlformats.org/drawingml/2006/picture">
+                <pic:pic>
+                  <pic:nvPicPr>
+                    <pic:cNvPr id="0" name="p5_s56.png"/>
+                    <pic:cNvPicPr/>
+                  </pic:nvPicPr>
+                  <pic:blipFill>
+                    <a:blip r:embed="rId36"/>
+                    <a:stretch>
+                      <a:fillRect/>
+                    </a:stretch>
+                  </pic:blipFill>
+                  <pic:spPr>
+                    <a:xfrm>
+                      <a:off x="0" y="0"/>
+                      <a:ext cx="5400000" cy="5250000"/>
+                    </a:xfrm>
+                    <a:prstGeom prst="rect"/>
+                  </pic:spPr>
+                </pic:pic>
+              </a:graphicData>
+            </a:graphic>
+          </wp:inline>
+        </w:drawing>
+      </w:r>
+    </w:p>
+    <w:p>
+      <w:pPr>
+        <w:jc w:val="center"/>
+      </w:pPr>
+      <w:r>
+        <w:rPr>
+          <w:rFonts w:ascii="Times New Roman" w:hAnsi="Times New Roman" w:eastAsia="Times New Roman"/>
+          <w:b w:val="0"/>
+          <w:sz w:val="20"/>
+        </w:rPr>
+        <w:t>Рисунок 29 — Размер по умолчанию (56 байт)</w:t>
+      </w:r>
+    </w:p>
+    <w:p>
+      <w:pPr>
+        <w:jc w:val="center"/>
+      </w:pPr>
+      <w:r>
+        <w:drawing>
+          <wp:inline>
+            <wp:extent cx="5400000" cy="5250000"/>
+            <wp:docPr id="30" name="Picture 30"/>
+            <wp:cNvGraphicFramePr>
+              <a:graphicFrameLocks noChangeAspect="1"/>
+            </wp:cNvGraphicFramePr>
+            <a:graphic>
+              <a:graphicData uri="http://schemas.openxmlformats.org/drawingml/2006/picture">
+                <pic:pic>
+                  <pic:nvPicPr>
+                    <pic:cNvPr id="0" name="p5_s100.png"/>
+                    <pic:cNvPicPr/>
+                  </pic:nvPicPr>
+                  <pic:blipFill>
+                    <a:blip r:embed="rId37"/>
+                    <a:stretch>
+                      <a:fillRect/>
+                    </a:stretch>
+                  </pic:blipFill>
+                  <pic:spPr>
+                    <a:xfrm>
+                      <a:off x="0" y="0"/>
+                      <a:ext cx="5400000" cy="5250000"/>
+                    </a:xfrm>
+                    <a:prstGeom prst="rect"/>
+                  </pic:spPr>
+                </pic:pic>
+              </a:graphicData>
+            </a:graphic>
+          </wp:inline>
+        </w:drawing>
+      </w:r>
+    </w:p>
+    <w:p>
+      <w:pPr>
+        <w:jc w:val="center"/>
+      </w:pPr>
+      <w:r>
+        <w:rPr>
+          <w:rFonts w:ascii="Times New Roman" w:hAnsi="Times New Roman" w:eastAsia="Times New Roman"/>
+          <w:b w:val="0"/>
+          <w:sz w:val="20"/>
+        </w:rPr>
+        <w:t>Рисунок 30 — Размер 100 байт</w:t>
+      </w:r>
+    </w:p>
+    <w:p>
+      <w:pPr>
+        <w:jc w:val="center"/>
+      </w:pPr>
+      <w:r>
+        <w:drawing>
+          <wp:inline>
+            <wp:extent cx="5400000" cy="5372910"/>
+            <wp:docPr id="31" name="Picture 31"/>
+            <wp:cNvGraphicFramePr>
+              <a:graphicFrameLocks noChangeAspect="1"/>
+            </wp:cNvGraphicFramePr>
+            <a:graphic>
+              <a:graphicData uri="http://schemas.openxmlformats.org/drawingml/2006/picture">
+                <pic:pic>
+                  <pic:nvPicPr>
+                    <pic:cNvPr id="0" name="p5_s10100.png"/>
+                    <pic:cNvPicPr/>
+                  </pic:nvPicPr>
+                  <pic:blipFill>
+                    <a:blip r:embed="rId38"/>
+                    <a:stretch>
+                      <a:fillRect/>
+                    </a:stretch>
+                  </pic:blipFill>
+                  <pic:spPr>
+                    <a:xfrm>
+                      <a:off x="0" y="0"/>
+                      <a:ext cx="5400000" cy="5372910"/>
+                    </a:xfrm>
+                    <a:prstGeom prst="rect"/>
+                  </pic:spPr>
+                </pic:pic>
+              </a:graphicData>
+            </a:graphic>
+          </wp:inline>
+        </w:drawing>
+      </w:r>
+    </w:p>
+    <w:p>
+      <w:pPr>
+        <w:jc w:val="center"/>
+      </w:pPr>
+      <w:r>
+        <w:rPr>
+          <w:rFonts w:ascii="Times New Roman" w:hAnsi="Times New Roman" w:eastAsia="Times New Roman"/>
+          <w:b w:val="0"/>
+          <w:sz w:val="20"/>
+        </w:rPr>
+        <w:t>Рисунок 31 — Размер 10100 байт</w:t>
+      </w:r>
+    </w:p>
+    <w:p>
+      <w:pPr>
+        <w:jc w:val="center"/>
+      </w:pPr>
+      <w:r>
+        <w:drawing>
+          <wp:inline>
+            <wp:extent cx="5400000" cy="5372910"/>
+            <wp:docPr id="32" name="Picture 32"/>
+            <wp:cNvGraphicFramePr>
+              <a:graphicFrameLocks noChangeAspect="1"/>
+            </wp:cNvGraphicFramePr>
+            <a:graphic>
+              <a:graphicData uri="http://schemas.openxmlformats.org/drawingml/2006/picture">
+                <pic:pic>
+                  <pic:nvPicPr>
+                    <pic:cNvPr id="0" name="p5_s20100.png"/>
+                    <pic:cNvPicPr/>
+                  </pic:nvPicPr>
+                  <pic:blipFill>
+                    <a:blip r:embed="rId39"/>
+                    <a:stretch>
+                      <a:fillRect/>
+                    </a:stretch>
+                  </pic:blipFill>
+                  <pic:spPr>
+                    <a:xfrm>
+                      <a:off x="0" y="0"/>
+                      <a:ext cx="5400000" cy="5372910"/>
+                    </a:xfrm>
+                    <a:prstGeom prst="rect"/>
+                  </pic:spPr>
+                </pic:pic>
+              </a:graphicData>
+            </a:graphic>
+          </wp:inline>
+        </w:drawing>
+      </w:r>
+    </w:p>
+    <w:p>
+      <w:pPr>
+        <w:jc w:val="center"/>
+      </w:pPr>
+      <w:r>
+        <w:rPr>
+          <w:rFonts w:ascii="Times New Roman" w:hAnsi="Times New Roman" w:eastAsia="Times New Roman"/>
+          <w:b w:val="0"/>
+          <w:sz w:val="20"/>
+        </w:rPr>
+        <w:t>Рисунок 32 — Размер 20100 байт</w:t>
+      </w:r>
+    </w:p>
+    <w:p>
+      <w:pPr>
+        <w:jc w:val="center"/>
+      </w:pPr>
+      <w:r>
+        <w:drawing>
+          <wp:inline>
+            <wp:extent cx="5400000" cy="5372910"/>
+            <wp:docPr id="33" name="Picture 33"/>
+            <wp:cNvGraphicFramePr>
+              <a:graphicFrameLocks noChangeAspect="1"/>
+            </wp:cNvGraphicFramePr>
+            <a:graphic>
+              <a:graphicData uri="http://schemas.openxmlformats.org/drawingml/2006/picture">
+                <pic:pic>
+                  <pic:nvPicPr>
+                    <pic:cNvPr id="0" name="p5_s30100.png"/>
+                    <pic:cNvPicPr/>
+                  </pic:nvPicPr>
+                  <pic:blipFill>
+                    <a:blip r:embed="rId40"/>
+                    <a:stretch>
+                      <a:fillRect/>
+                    </a:stretch>
+                  </pic:blipFill>
+                  <pic:spPr>
+                    <a:xfrm>
+                      <a:off x="0" y="0"/>
+                      <a:ext cx="5400000" cy="5372910"/>
+                    </a:xfrm>
+                    <a:prstGeom prst="rect"/>
+                  </pic:spPr>
+                </pic:pic>
+              </a:graphicData>
+            </a:graphic>
+          </wp:inline>
+        </w:drawing>
+      </w:r>
+    </w:p>
+    <w:p>
+      <w:pPr>
+        <w:jc w:val="center"/>
+      </w:pPr>
+      <w:r>
+        <w:rPr>
+          <w:rFonts w:ascii="Times New Roman" w:hAnsi="Times New Roman" w:eastAsia="Times New Roman"/>
+          <w:b w:val="0"/>
+          <w:sz w:val="20"/>
+        </w:rPr>
+        <w:t>Рисунок 33 — Размер 30100 байт</w:t>
+      </w:r>
+    </w:p>
+    <w:p>
+      <w:pPr>
+        <w:jc w:val="center"/>
+      </w:pPr>
+      <w:r>
+        <w:drawing>
+          <wp:inline>
+            <wp:extent cx="5400000" cy="5372910"/>
+            <wp:docPr id="34" name="Picture 34"/>
+            <wp:cNvGraphicFramePr>
+              <a:graphicFrameLocks noChangeAspect="1"/>
+            </wp:cNvGraphicFramePr>
+            <a:graphic>
+              <a:graphicData uri="http://schemas.openxmlformats.org/drawingml/2006/picture">
+                <pic:pic>
+                  <pic:nvPicPr>
+                    <pic:cNvPr id="0" name="p5_s40100.png"/>
+                    <pic:cNvPicPr/>
+                  </pic:nvPicPr>
+                  <pic:blipFill>
+                    <a:blip r:embed="rId41"/>
+                    <a:stretch>
+                      <a:fillRect/>
+                    </a:stretch>
+                  </pic:blipFill>
+                  <pic:spPr>
+                    <a:xfrm>
+                      <a:off x="0" y="0"/>
+                      <a:ext cx="5400000" cy="5372910"/>
+                    </a:xfrm>
+                    <a:prstGeom prst="rect"/>
+                  </pic:spPr>
+                </pic:pic>
+              </a:graphicData>
+            </a:graphic>
+          </wp:inline>
+        </w:drawing>
+      </w:r>
+    </w:p>
+    <w:p>
+      <w:pPr>
+        <w:jc w:val="center"/>
+      </w:pPr>
+      <w:r>
+        <w:rPr>
+          <w:rFonts w:ascii="Times New Roman" w:hAnsi="Times New Roman" w:eastAsia="Times New Roman"/>
+          <w:b w:val="0"/>
+          <w:sz w:val="20"/>
+        </w:rPr>
+        <w:t>Рисунок 34 — Размер 40100 байт</w:t>
+      </w:r>
+    </w:p>
+    <w:p>
+      <w:pPr>
+        <w:jc w:val="center"/>
+      </w:pPr>
+      <w:r>
+        <w:drawing>
+          <wp:inline>
+            <wp:extent cx="5400000" cy="5372910"/>
+            <wp:docPr id="35" name="Picture 35"/>
+            <wp:cNvGraphicFramePr>
+              <a:graphicFrameLocks noChangeAspect="1"/>
+            </wp:cNvGraphicFramePr>
+            <a:graphic>
+              <a:graphicData uri="http://schemas.openxmlformats.org/drawingml/2006/picture">
+                <pic:pic>
+                  <pic:nvPicPr>
+                    <pic:cNvPr id="0" name="p5_s50100.png"/>
+                    <pic:cNvPicPr/>
+                  </pic:nvPicPr>
+                  <pic:blipFill>
+                    <a:blip r:embed="rId42"/>
+                    <a:stretch>
+                      <a:fillRect/>
+                    </a:stretch>
+                  </pic:blipFill>
+                  <pic:spPr>
+                    <a:xfrm>
+                      <a:off x="0" y="0"/>
+                      <a:ext cx="5400000" cy="5372910"/>
+                    </a:xfrm>
+                    <a:prstGeom prst="rect"/>
+                  </pic:spPr>
+                </pic:pic>
+              </a:graphicData>
+            </a:graphic>
+          </wp:inline>
+        </w:drawing>
+      </w:r>
+    </w:p>
+    <w:p>
+      <w:pPr>
+        <w:jc w:val="center"/>
+      </w:pPr>
+      <w:r>
+        <w:rPr>
+          <w:rFonts w:ascii="Times New Roman" w:hAnsi="Times New Roman" w:eastAsia="Times New Roman"/>
+          <w:b w:val="0"/>
+          <w:sz w:val="20"/>
+        </w:rPr>
+        <w:t>Рисунок 35 — Размер 50100 байт</w:t>
+      </w:r>
+    </w:p>
+    <w:p>
+      <w:pPr>
+        <w:jc w:val="center"/>
+      </w:pPr>
+      <w:r>
+        <w:drawing>
+          <wp:inline>
+            <wp:extent cx="5400000" cy="5372910"/>
+            <wp:docPr id="36" name="Picture 36"/>
+            <wp:cNvGraphicFramePr>
+              <a:graphicFrameLocks noChangeAspect="1"/>
+            </wp:cNvGraphicFramePr>
+            <a:graphic>
+              <a:graphicData uri="http://schemas.openxmlformats.org/drawingml/2006/picture">
+                <pic:pic>
+                  <pic:nvPicPr>
+                    <pic:cNvPr id="0" name="p5_s60100.png"/>
+                    <pic:cNvPicPr/>
+                  </pic:nvPicPr>
+                  <pic:blipFill>
+                    <a:blip r:embed="rId43"/>
+                    <a:stretch>
+                      <a:fillRect/>
+                    </a:stretch>
+                  </pic:blipFill>
+                  <pic:spPr>
+                    <a:xfrm>
+                      <a:off x="0" y="0"/>
+                      <a:ext cx="5400000" cy="5372910"/>
+                    </a:xfrm>
+                    <a:prstGeom prst="rect"/>
+                  </pic:spPr>
+                </pic:pic>
+              </a:graphicData>
+            </a:graphic>
+          </wp:inline>
+        </w:drawing>
+      </w:r>
+    </w:p>
+    <w:p>
+      <w:pPr>
+        <w:jc w:val="center"/>
+      </w:pPr>
+      <w:r>
+        <w:rPr>
+          <w:rFonts w:ascii="Times New Roman" w:hAnsi="Times New Roman" w:eastAsia="Times New Roman"/>
+          <w:b w:val="0"/>
+          <w:sz w:val="20"/>
+        </w:rPr>
+        <w:t>Рисунок 36 — Размер 60100 байт</w:t>
+      </w:r>
+    </w:p>
+    <w:p>
+      <w:pPr>
         <w:pStyle w:val="Heading1"/>
       </w:pPr>
       <w:r>
@@ -2554,6 +3268,26 @@
           <w:sz w:val="22"/>
         </w:rPr>
         <w:t>traceroute наращивает TTL и ждёт ответ ICMP Time Exceeded от каждого маршрутизатора, но тип зондирующих пакетов у режимов разный (ICMP echo, UDP на высокие порты, TCP SYN), и устройства по пути их обрабатывают по-разному. Моя виртуальная машина за NAT VirtualBox: NAT-устройство не пересылает наружу пакеты с малым TTL, а само принимает соединение и отвечает от имени адресата. Поэтому для ICMP и TCP узел 8.8.8.8 ответил уже на первом шаге (NAT завершает такой обмен самостоятельно), для UDP ответил только шлюз 10.0.2.1, а на остальных шагах ответов нет — NAT не транслирует ICMP Time Exceeded для UDP-проб. Дополнительно межсетевые экраны часто отбрасывают UDP и ICMP. С запретом фрагментации (DF): пакет 1400 байт проходит, пакет 1500 байт теряется на всех шагах (с заголовком NAT превышает допустимое), а 1600 байт больше MTU интерфейса 1500 и возвращает ошибку !F-1500: узел сообщает, что фрагментация необходима, а запрещена. Фрагментация по маршруту, таким образом, не используется при DF, и MTU пути равен 1500 или меньше.</w:t>
+      </w:r>
+    </w:p>
+    <w:p>
+      <w:r>
+        <w:rPr>
+          <w:rFonts w:ascii="Times New Roman" w:hAnsi="Times New Roman" w:eastAsia="Times New Roman"/>
+          <w:b/>
+          <w:sz w:val="22"/>
+        </w:rPr>
+        <w:t>10. Как изменяется загрузка интерфейса в Части 5. п. 3? Почему?</w:t>
+      </w:r>
+    </w:p>
+    <w:p>
+      <w:r>
+        <w:rPr>
+          <w:rFonts w:ascii="Times New Roman" w:hAnsi="Times New Roman" w:eastAsia="Times New Roman"/>
+          <w:b w:val="0"/>
+          <w:sz w:val="22"/>
+        </w:rPr>
+        <w:t>Загрузка растёт и выходит на насыщение: от 382 КиБ/с при 100 байтах до 7,43 МиБ/с при 10100 и далее медленно до 9,6 МиБ/с при 50100–60100 байтах (рост между 10100 и 60100 всего около 30 %). Число пакетов в секунду тоже растёт (с 2,75 до 6,7 тысяч), потому что большие ICMP-сообщения не помещаются в MTU 1500 и разбиваются на IP-фрагменты, а bmon считает фрагменты как отдельные пакеты; поэтому один запрос размером 60100 байт даёт около 41 фрагмента. Ping -f отправляет следующий запрос сразу после ответа, поэтому скорость ограничена пропускной способностью виртуального канала и производительностью обработки в виртуальных машинах: при увеличении размера нагрузка не растёт пропорционально, а выходит на предел около 9,6 МиБ/с.</w:t>
       </w:r>
     </w:p>
     <w:sectPr>

</xml_diff>

<commit_message>
Lab 3: Part 6 vnstat
Co-Authored-By: Claude Sonnet 5.5 <noreply@anthropic.com>
Claude-Session: https://claude.ai/code/session_01AxRBWGkpGe1tM1Y5SaPo4g
</commit_message>
<xml_diff>
--- a/lab3/lab-3_report.docx
+++ b/lab3/lab-3_report.docx
@@ -533,6 +533,57 @@
           <w:sz w:val="22"/>
         </w:rPr>
         <w:t>3. Менял размер пакета ping от 100 до 60100 байт с шагом 10000 и фиксировал в bmon скорость приёма (RX) и число пакетов в секунду. Скорость выросла со 382 КиБ/с до 9,6 МиБ/с, число пакетов в секунду — с 2,75 до 6,7 тысяч (см. таблицу).</w:t>
+      </w:r>
+    </w:p>
+    <w:p/>
+    <w:p>
+      <w:r>
+        <w:rPr>
+          <w:rFonts w:ascii="Times New Roman" w:hAnsi="Times New Roman" w:eastAsia="Times New Roman"/>
+          <w:b/>
+          <w:sz w:val="24"/>
+        </w:rPr>
+        <w:t>Часть 6. Сбор статистики о загрузке сетевого интерфейса</w:t>
+      </w:r>
+    </w:p>
+    <w:p>
+      <w:r>
+        <w:rPr>
+          <w:rFonts w:ascii="Times New Roman" w:hAnsi="Times New Roman" w:eastAsia="Times New Roman"/>
+          <w:b w:val="0"/>
+          <w:sz w:val="22"/>
+        </w:rPr>
+        <w:t>1. На c7-1 запустил демон vnstat (vnstat 2.x) командой systemctl enable --now vnstat.</w:t>
+      </w:r>
+    </w:p>
+    <w:p>
+      <w:r>
+        <w:rPr>
+          <w:rFonts w:ascii="Times New Roman" w:hAnsi="Times New Roman" w:eastAsia="Times New Roman"/>
+          <w:b w:val="0"/>
+          <w:sz w:val="22"/>
+        </w:rPr>
+        <w:t>2. Поставил на мониторинг интерфейс enp0s3, через который c7-1 подключён к c7-2 (vnstat --add -i enp0s3; интерфейс уже присутствовал в базе).</w:t>
+      </w:r>
+    </w:p>
+    <w:p>
+      <w:r>
+        <w:rPr>
+          <w:rFonts w:ascii="Times New Roman" w:hAnsi="Times New Roman" w:eastAsia="Times New Roman"/>
+          <w:b w:val="0"/>
+          <w:sz w:val="22"/>
+        </w:rPr>
+        <w:t>3. С c7-2 отправил 500 пакетов в режиме flood: ping -f -c 500 10.0.2.16 — получены все 500, потерь нет.</w:t>
+      </w:r>
+    </w:p>
+    <w:p>
+      <w:r>
+        <w:rPr>
+          <w:rFonts w:ascii="Times New Roman" w:hAnsi="Times New Roman" w:eastAsia="Times New Roman"/>
+          <w:b w:val="0"/>
+          <w:sz w:val="22"/>
+        </w:rPr>
+        <w:t>4. Принудительно сохранил данные перезапуском демона (в версии 2.x база пишется раз в 5 минут) и вывел статистику: vnstat -i enp0s3 и vnstat -i enp0s3 -5. В 5-минутном интервале 15:50 учтено 48,66 КиБ принятого и 48,42 КиБ переданного трафика, что соответствует 500 кадрам по 98 байт.</w:t>
       </w:r>
     </w:p>
     <w:p/>
@@ -3084,6 +3135,258 @@
     </w:p>
     <w:p>
       <w:pPr>
+        <w:pStyle w:val="Heading2"/>
+      </w:pPr>
+      <w:r>
+        <w:t>Артефакт 10. Статистика vnstat (Часть 6, п. 4)</w:t>
+      </w:r>
+    </w:p>
+    <w:p>
+      <w:r>
+        <w:rPr>
+          <w:rFonts w:ascii="Times New Roman" w:hAnsi="Times New Roman" w:eastAsia="Times New Roman"/>
+          <w:b w:val="0"/>
+          <w:sz w:val="22"/>
+        </w:rPr>
+        <w:t>c7-1: запуск демона vnstat и вывод статистики интерфейса enp0s3 после отправки 500 пакетов ping -f с c7-2. В интервале 15:50 (500 запросов и 500 ответов): RX 48,66 КиБ, TX 48,42 КиБ. Остальные строки — трафик более ранних замеров (Часть 5).</w:t>
+      </w:r>
+    </w:p>
+    <w:p>
+      <w:pPr>
+        <w:spacing w:after="0"/>
+      </w:pPr>
+      <w:r>
+        <w:rPr>
+          <w:rFonts w:ascii="Courier New" w:hAnsi="Courier New" w:eastAsia="Courier New"/>
+          <w:b w:val="0"/>
+          <w:sz w:val="17"/>
+        </w:rPr>
+        <w:t>systemctl enable --now vnstat</w:t>
+      </w:r>
+    </w:p>
+    <w:p>
+      <w:pPr>
+        <w:spacing w:after="0"/>
+      </w:pPr>
+      <w:r>
+        <w:rPr>
+          <w:rFonts w:ascii="Courier New" w:hAnsi="Courier New" w:eastAsia="Courier New"/>
+          <w:b w:val="0"/>
+          <w:sz w:val="17"/>
+        </w:rPr>
+        <w:t>vnstat --add -i enp0s3</w:t>
+      </w:r>
+    </w:p>
+    <w:p>
+      <w:pPr>
+        <w:spacing w:after="0"/>
+      </w:pPr>
+      <w:r>
+        <w:rPr>
+          <w:rFonts w:ascii="Courier New" w:hAnsi="Courier New" w:eastAsia="Courier New"/>
+          <w:b w:val="0"/>
+          <w:sz w:val="17"/>
+        </w:rPr>
+        <w:t>c7-2: ping -f -c 500 10.0.2.16</w:t>
+      </w:r>
+    </w:p>
+    <w:p>
+      <w:pPr>
+        <w:spacing w:after="0"/>
+      </w:pPr>
+      <w:r>
+        <w:rPr>
+          <w:rFonts w:ascii="Courier New" w:hAnsi="Courier New" w:eastAsia="Courier New"/>
+          <w:b w:val="0"/>
+          <w:sz w:val="17"/>
+        </w:rPr>
+        <w:t>systemctl restart vnstat</w:t>
+      </w:r>
+    </w:p>
+    <w:p>
+      <w:pPr>
+        <w:spacing w:after="0"/>
+      </w:pPr>
+      <w:r>
+        <w:rPr>
+          <w:rFonts w:ascii="Courier New" w:hAnsi="Courier New" w:eastAsia="Courier New"/>
+          <w:b w:val="0"/>
+          <w:sz w:val="17"/>
+        </w:rPr>
+        <w:t>vnstat -i enp0s3</w:t>
+      </w:r>
+    </w:p>
+    <w:p>
+      <w:pPr>
+        <w:spacing w:after="0"/>
+      </w:pPr>
+      <w:r>
+        <w:rPr>
+          <w:rFonts w:ascii="Courier New" w:hAnsi="Courier New" w:eastAsia="Courier New"/>
+          <w:b w:val="0"/>
+          <w:sz w:val="17"/>
+        </w:rPr>
+        <w:t>vnstat -i enp0s3 -5</w:t>
+      </w:r>
+    </w:p>
+    <w:p>
+      <w:pPr>
+        <w:jc w:val="center"/>
+      </w:pPr>
+      <w:r>
+        <w:drawing>
+          <wp:inline>
+            <wp:extent cx="5400000" cy="1159322"/>
+            <wp:docPr id="37" name="Picture 37"/>
+            <wp:cNvGraphicFramePr>
+              <a:graphicFrameLocks noChangeAspect="1"/>
+            </wp:cNvGraphicFramePr>
+            <a:graphic>
+              <a:graphicData uri="http://schemas.openxmlformats.org/drawingml/2006/picture">
+                <pic:pic>
+                  <pic:nvPicPr>
+                    <pic:cNvPr id="0" name="p6_start.png"/>
+                    <pic:cNvPicPr/>
+                  </pic:nvPicPr>
+                  <pic:blipFill>
+                    <a:blip r:embed="rId44"/>
+                    <a:stretch>
+                      <a:fillRect/>
+                    </a:stretch>
+                  </pic:blipFill>
+                  <pic:spPr>
+                    <a:xfrm>
+                      <a:off x="0" y="0"/>
+                      <a:ext cx="5400000" cy="1159322"/>
+                    </a:xfrm>
+                    <a:prstGeom prst="rect"/>
+                  </pic:spPr>
+                </pic:pic>
+              </a:graphicData>
+            </a:graphic>
+          </wp:inline>
+        </w:drawing>
+      </w:r>
+    </w:p>
+    <w:p>
+      <w:pPr>
+        <w:jc w:val="center"/>
+      </w:pPr>
+      <w:r>
+        <w:rPr>
+          <w:rFonts w:ascii="Times New Roman" w:hAnsi="Times New Roman" w:eastAsia="Times New Roman"/>
+          <w:b w:val="0"/>
+          <w:sz w:val="20"/>
+        </w:rPr>
+        <w:t>Рисунок 37 — Запуск vnstat и добавление интерфейса enp0s3</w:t>
+      </w:r>
+    </w:p>
+    <w:p>
+      <w:pPr>
+        <w:jc w:val="center"/>
+      </w:pPr>
+      <w:r>
+        <w:drawing>
+          <wp:inline>
+            <wp:extent cx="5400000" cy="4465096"/>
+            <wp:docPr id="38" name="Picture 38"/>
+            <wp:cNvGraphicFramePr>
+              <a:graphicFrameLocks noChangeAspect="1"/>
+            </wp:cNvGraphicFramePr>
+            <a:graphic>
+              <a:graphicData uri="http://schemas.openxmlformats.org/drawingml/2006/picture">
+                <pic:pic>
+                  <pic:nvPicPr>
+                    <pic:cNvPr id="0" name="p6_5min.png"/>
+                    <pic:cNvPicPr/>
+                  </pic:nvPicPr>
+                  <pic:blipFill>
+                    <a:blip r:embed="rId45"/>
+                    <a:stretch>
+                      <a:fillRect/>
+                    </a:stretch>
+                  </pic:blipFill>
+                  <pic:spPr>
+                    <a:xfrm>
+                      <a:off x="0" y="0"/>
+                      <a:ext cx="5400000" cy="4465096"/>
+                    </a:xfrm>
+                    <a:prstGeom prst="rect"/>
+                  </pic:spPr>
+                </pic:pic>
+              </a:graphicData>
+            </a:graphic>
+          </wp:inline>
+        </w:drawing>
+      </w:r>
+    </w:p>
+    <w:p>
+      <w:pPr>
+        <w:jc w:val="center"/>
+      </w:pPr>
+      <w:r>
+        <w:rPr>
+          <w:rFonts w:ascii="Times New Roman" w:hAnsi="Times New Roman" w:eastAsia="Times New Roman"/>
+          <w:b w:val="0"/>
+          <w:sz w:val="20"/>
+        </w:rPr>
+        <w:t>Рисунок 38 — vnstat -i enp0s3 -5 (интервал 15:50: 500 пакетов)</w:t>
+      </w:r>
+    </w:p>
+    <w:p>
+      <w:pPr>
+        <w:jc w:val="center"/>
+      </w:pPr>
+      <w:r>
+        <w:drawing>
+          <wp:inline>
+            <wp:extent cx="5400000" cy="4465096"/>
+            <wp:docPr id="39" name="Picture 39"/>
+            <wp:cNvGraphicFramePr>
+              <a:graphicFrameLocks noChangeAspect="1"/>
+            </wp:cNvGraphicFramePr>
+            <a:graphic>
+              <a:graphicData uri="http://schemas.openxmlformats.org/drawingml/2006/picture">
+                <pic:pic>
+                  <pic:nvPicPr>
+                    <pic:cNvPr id="0" name="p6_sum.png"/>
+                    <pic:cNvPicPr/>
+                  </pic:nvPicPr>
+                  <pic:blipFill>
+                    <a:blip r:embed="rId46"/>
+                    <a:stretch>
+                      <a:fillRect/>
+                    </a:stretch>
+                  </pic:blipFill>
+                  <pic:spPr>
+                    <a:xfrm>
+                      <a:off x="0" y="0"/>
+                      <a:ext cx="5400000" cy="4465096"/>
+                    </a:xfrm>
+                    <a:prstGeom prst="rect"/>
+                  </pic:spPr>
+                </pic:pic>
+              </a:graphicData>
+            </a:graphic>
+          </wp:inline>
+        </w:drawing>
+      </w:r>
+    </w:p>
+    <w:p>
+      <w:pPr>
+        <w:jc w:val="center"/>
+      </w:pPr>
+      <w:r>
+        <w:rPr>
+          <w:rFonts w:ascii="Times New Roman" w:hAnsi="Times New Roman" w:eastAsia="Times New Roman"/>
+          <w:b w:val="0"/>
+          <w:sz w:val="20"/>
+        </w:rPr>
+        <w:t>Рисунок 39 — vnstat -i enp0s3: итоги по интерфейсу</w:t>
+      </w:r>
+    </w:p>
+    <w:p>
+      <w:pPr>
         <w:pStyle w:val="Heading1"/>
       </w:pPr>
       <w:r>
@@ -3288,6 +3591,26 @@
           <w:sz w:val="22"/>
         </w:rPr>
         <w:t>Загрузка растёт и выходит на насыщение: от 382 КиБ/с при 100 байтах до 7,43 МиБ/с при 10100 и далее медленно до 9,6 МиБ/с при 50100–60100 байтах (рост между 10100 и 60100 всего около 30 %). Число пакетов в секунду тоже растёт (с 2,75 до 6,7 тысяч), потому что большие ICMP-сообщения не помещаются в MTU 1500 и разбиваются на IP-фрагменты, а bmon считает фрагменты как отдельные пакеты; поэтому один запрос размером 60100 байт даёт около 41 фрагмента. Ping -f отправляет следующий запрос сразу после ответа, поэтому скорость ограничена пропускной способностью виртуального канала и производительностью обработки в виртуальных машинах: при увеличении размера нагрузка не растёт пропорционально, а выходит на предел около 9,6 МиБ/с.</w:t>
+      </w:r>
+    </w:p>
+    <w:p>
+      <w:r>
+        <w:rPr>
+          <w:rFonts w:ascii="Times New Roman" w:hAnsi="Times New Roman" w:eastAsia="Times New Roman"/>
+          <w:b/>
+          <w:sz w:val="22"/>
+        </w:rPr>
+        <w:t>12. На каком уровне модели OSI работает vnstat?</w:t>
+      </w:r>
+    </w:p>
+    <w:p>
+      <w:r>
+        <w:rPr>
+          <w:rFonts w:ascii="Times New Roman" w:hAnsi="Times New Roman" w:eastAsia="Times New Roman"/>
+          <w:b w:val="0"/>
+          <w:sz w:val="22"/>
+        </w:rPr>
+        <w:t>На канальном (втором) уровне. vnstat не перехватывает пакеты, а периодически считывает счётчики сетевого интерфейса, которые ведёт ядро (/proc/net/dev, /sys/class/net/&lt;интерфейс&gt;/statistics): число принятых и переданных байт и кадров интерфейса. Эти счётчики включают заголовки Ethernet, что видно по результату: 500 ICMP-пакетов по 84 байта дали около 98 байт на кадр (56 данных + 8 ICMP + 20 IP + 14 Ethernet), всего ≈ 48 КиБ.</w:t>
       </w:r>
     </w:p>
     <w:sectPr>

</xml_diff>

<commit_message>
Lab 3: Part 7 report and answer 11
Co-Authored-By: Claude Sonnet 5.5 <noreply@anthropic.com>
Claude-Session: https://claude.ai/code/session_01AxRBWGkpGe1tM1Y5SaPo4g
</commit_message>
<xml_diff>
--- a/lab3/lab-3_report.docx
+++ b/lab3/lab-3_report.docx
@@ -584,6 +584,57 @@
           <w:sz w:val="22"/>
         </w:rPr>
         <w:t>4. Принудительно сохранил данные перезапуском демона (в версии 2.x база пишется раз в 5 минут) и вывел статистику: vnstat -i enp0s3 и vnstat -i enp0s3 -5. В 5-минутном интервале 15:50 учтено 48,66 КиБ принятого и 48,42 КиБ переданного трафика, что соответствует 500 кадрам по 98 байт.</w:t>
+      </w:r>
+    </w:p>
+    <w:p/>
+    <w:p>
+      <w:r>
+        <w:rPr>
+          <w:rFonts w:ascii="Times New Roman" w:hAnsi="Times New Roman" w:eastAsia="Times New Roman"/>
+          <w:b/>
+          <w:sz w:val="24"/>
+        </w:rPr>
+        <w:t>Часть 7. Диагностика работы приложений через сеть</w:t>
+      </w:r>
+    </w:p>
+    <w:p>
+      <w:r>
+        <w:rPr>
+          <w:rFonts w:ascii="Times New Roman" w:hAnsi="Times New Roman" w:eastAsia="Times New Roman"/>
+          <w:b w:val="0"/>
+          <w:sz w:val="22"/>
+        </w:rPr>
+        <w:t>1. На c7-1 установил и запустил SSH-сервер (openssh-server, порт 22). С c7-2 открыл несколько одновременных SSH-соединений с помощью sshpass (команда sshpass -p ... ssh -n user@10.0.2.16 'sleep 900' &amp;).</w:t>
+      </w:r>
+    </w:p>
+    <w:p>
+      <w:r>
+        <w:rPr>
+          <w:rFonts w:ascii="Times New Roman" w:hAnsi="Times New Roman" w:eastAsia="Times New Roman"/>
+          <w:b w:val="0"/>
+          <w:sz w:val="22"/>
+        </w:rPr>
+        <w:t>2. Командой lsof -i -P -n | grep LISTEN вывел прослушиваемые порты, командой ss -tn state established — установленные соединения (четыре соединения 10.0.2.4 → 10.0.2.16:22).</w:t>
+      </w:r>
+    </w:p>
+    <w:p>
+      <w:r>
+        <w:rPr>
+          <w:rFonts w:ascii="Times New Roman" w:hAnsi="Times New Roman" w:eastAsia="Times New Roman"/>
+          <w:b w:val="0"/>
+          <w:sz w:val="22"/>
+        </w:rPr>
+        <w:t>3. Написал скрипт conn.sh: выводит список IP-адресов и количество соединений с них на порт, заданный первым параметром (по умолчанию 22), по убыванию числа соединений.</w:t>
+      </w:r>
+    </w:p>
+    <w:p>
+      <w:r>
+        <w:rPr>
+          <w:rFonts w:ascii="Times New Roman" w:hAnsi="Times New Roman" w:eastAsia="Times New Roman"/>
+          <w:b w:val="0"/>
+          <w:sz w:val="22"/>
+        </w:rPr>
+        <w:t>4. Закрыл соединения (pkill sshpass), подключился с c7-2 одним соединением и запустил в нём top. На c7-1 запустил nethogs -d 1 enp0s3 и определил среднюю скорость передачи sshd (2,427 КБ/с отправка, 0,258 КБ/с приём) и PID сеансового процесса sshd (1270; PID процесса sshd, принимающего соединения на порту 22, — 486).</w:t>
       </w:r>
     </w:p>
     <w:p/>
@@ -3387,6 +3438,398 @@
     </w:p>
     <w:p>
       <w:pPr>
+        <w:pStyle w:val="Heading2"/>
+      </w:pPr>
+      <w:r>
+        <w:t>Артефакт 11. Диагностика приложений (Часть 7, п. 2, 3, 4, 8)</w:t>
+      </w:r>
+    </w:p>
+    <w:p>
+      <w:r>
+        <w:rPr>
+          <w:rFonts w:ascii="Times New Roman" w:hAnsi="Times New Roman" w:eastAsia="Times New Roman"/>
+          <w:b w:val="0"/>
+          <w:sz w:val="22"/>
+        </w:rPr>
+        <w:t>п. 2: прослушиваемые порты (lsof). п. 3: установленные соединения (ss). п. 4: скрипт conn.sh и его вывод (4 соединения с адреса 10.0.2.4). п. 8: nethogs.</w:t>
+      </w:r>
+    </w:p>
+    <w:p>
+      <w:pPr>
+        <w:spacing w:after="0"/>
+      </w:pPr>
+      <w:r>
+        <w:rPr>
+          <w:rFonts w:ascii="Courier New" w:hAnsi="Courier New" w:eastAsia="Courier New"/>
+          <w:b w:val="0"/>
+          <w:sz w:val="17"/>
+        </w:rPr>
+        <w:t>lsof -i -P -n | grep LISTEN</w:t>
+      </w:r>
+    </w:p>
+    <w:p>
+      <w:pPr>
+        <w:spacing w:after="0"/>
+      </w:pPr>
+      <w:r>
+        <w:rPr>
+          <w:rFonts w:ascii="Courier New" w:hAnsi="Courier New" w:eastAsia="Courier New"/>
+          <w:b w:val="0"/>
+          <w:sz w:val="17"/>
+        </w:rPr>
+        <w:t>ss -tn state established</w:t>
+      </w:r>
+    </w:p>
+    <w:p>
+      <w:pPr>
+        <w:spacing w:after="0"/>
+      </w:pPr>
+    </w:p>
+    <w:p>
+      <w:pPr>
+        <w:spacing w:after="0"/>
+      </w:pPr>
+      <w:r>
+        <w:rPr>
+          <w:rFonts w:ascii="Courier New" w:hAnsi="Courier New" w:eastAsia="Courier New"/>
+          <w:b w:val="0"/>
+          <w:sz w:val="17"/>
+        </w:rPr>
+        <w:t># conn.sh</w:t>
+      </w:r>
+    </w:p>
+    <w:p>
+      <w:pPr>
+        <w:spacing w:after="0"/>
+      </w:pPr>
+      <w:r>
+        <w:rPr>
+          <w:rFonts w:ascii="Courier New" w:hAnsi="Courier New" w:eastAsia="Courier New"/>
+          <w:b w:val="0"/>
+          <w:sz w:val="17"/>
+        </w:rPr>
+        <w:t>#!/bin/bash</w:t>
+      </w:r>
+    </w:p>
+    <w:p>
+      <w:pPr>
+        <w:spacing w:after="0"/>
+      </w:pPr>
+      <w:r>
+        <w:rPr>
+          <w:rFonts w:ascii="Courier New" w:hAnsi="Courier New" w:eastAsia="Courier New"/>
+          <w:b w:val="0"/>
+          <w:sz w:val="17"/>
+        </w:rPr>
+        <w:t>P=${1:-22}</w:t>
+      </w:r>
+    </w:p>
+    <w:p>
+      <w:pPr>
+        <w:spacing w:after="0"/>
+      </w:pPr>
+      <w:r>
+        <w:rPr>
+          <w:rFonts w:ascii="Courier New" w:hAnsi="Courier New" w:eastAsia="Courier New"/>
+          <w:b w:val="0"/>
+          <w:sz w:val="17"/>
+        </w:rPr>
+        <w:t>ss -Htn state established |</w:t>
+      </w:r>
+    </w:p>
+    <w:p>
+      <w:pPr>
+        <w:spacing w:after="0"/>
+      </w:pPr>
+      <w:r>
+        <w:rPr>
+          <w:rFonts w:ascii="Courier New" w:hAnsi="Courier New" w:eastAsia="Courier New"/>
+          <w:b w:val="0"/>
+          <w:sz w:val="17"/>
+        </w:rPr>
+        <w:t>awk -v p=":$P" '$3 ~ p"$" {print $4}' |</w:t>
+      </w:r>
+    </w:p>
+    <w:p>
+      <w:pPr>
+        <w:spacing w:after="0"/>
+      </w:pPr>
+      <w:r>
+        <w:rPr>
+          <w:rFonts w:ascii="Courier New" w:hAnsi="Courier New" w:eastAsia="Courier New"/>
+          <w:b w:val="0"/>
+          <w:sz w:val="17"/>
+        </w:rPr>
+        <w:t>sed 's/:[0-9]*$//' | sort | uniq -c |</w:t>
+      </w:r>
+    </w:p>
+    <w:p>
+      <w:pPr>
+        <w:spacing w:after="0"/>
+      </w:pPr>
+      <w:r>
+        <w:rPr>
+          <w:rFonts w:ascii="Courier New" w:hAnsi="Courier New" w:eastAsia="Courier New"/>
+          <w:b w:val="0"/>
+          <w:sz w:val="17"/>
+        </w:rPr>
+        <w:t>sort -rn</w:t>
+      </w:r>
+    </w:p>
+    <w:p>
+      <w:pPr>
+        <w:spacing w:after="0"/>
+      </w:pPr>
+    </w:p>
+    <w:p>
+      <w:pPr>
+        <w:spacing w:after="0"/>
+      </w:pPr>
+      <w:r>
+        <w:rPr>
+          <w:rFonts w:ascii="Courier New" w:hAnsi="Courier New" w:eastAsia="Courier New"/>
+          <w:b w:val="0"/>
+          <w:sz w:val="17"/>
+        </w:rPr>
+        <w:t>./conn.sh</w:t>
+      </w:r>
+    </w:p>
+    <w:p>
+      <w:pPr>
+        <w:spacing w:after="0"/>
+      </w:pPr>
+      <w:r>
+        <w:rPr>
+          <w:rFonts w:ascii="Courier New" w:hAnsi="Courier New" w:eastAsia="Courier New"/>
+          <w:b w:val="0"/>
+          <w:sz w:val="17"/>
+        </w:rPr>
+        <w:t>./conn.sh 22</w:t>
+      </w:r>
+    </w:p>
+    <w:p>
+      <w:pPr>
+        <w:spacing w:after="0"/>
+      </w:pPr>
+      <w:r>
+        <w:rPr>
+          <w:rFonts w:ascii="Courier New" w:hAnsi="Courier New" w:eastAsia="Courier New"/>
+          <w:b w:val="0"/>
+          <w:sz w:val="17"/>
+        </w:rPr>
+        <w:t>nethogs -d 1 enp0s3</w:t>
+      </w:r>
+    </w:p>
+    <w:p>
+      <w:pPr>
+        <w:jc w:val="center"/>
+      </w:pPr>
+      <w:r>
+        <w:drawing>
+          <wp:inline>
+            <wp:extent cx="5400000" cy="1099445"/>
+            <wp:docPr id="40" name="Picture 40"/>
+            <wp:cNvGraphicFramePr>
+              <a:graphicFrameLocks noChangeAspect="1"/>
+            </wp:cNvGraphicFramePr>
+            <a:graphic>
+              <a:graphicData uri="http://schemas.openxmlformats.org/drawingml/2006/picture">
+                <pic:pic>
+                  <pic:nvPicPr>
+                    <pic:cNvPr id="0" name="p7_listen.png"/>
+                    <pic:cNvPicPr/>
+                  </pic:nvPicPr>
+                  <pic:blipFill>
+                    <a:blip r:embed="rId47"/>
+                    <a:stretch>
+                      <a:fillRect/>
+                    </a:stretch>
+                  </pic:blipFill>
+                  <pic:spPr>
+                    <a:xfrm>
+                      <a:off x="0" y="0"/>
+                      <a:ext cx="5400000" cy="1099445"/>
+                    </a:xfrm>
+                    <a:prstGeom prst="rect"/>
+                  </pic:spPr>
+                </pic:pic>
+              </a:graphicData>
+            </a:graphic>
+          </wp:inline>
+        </w:drawing>
+      </w:r>
+    </w:p>
+    <w:p>
+      <w:pPr>
+        <w:jc w:val="center"/>
+      </w:pPr>
+      <w:r>
+        <w:rPr>
+          <w:rFonts w:ascii="Times New Roman" w:hAnsi="Times New Roman" w:eastAsia="Times New Roman"/>
+          <w:b w:val="0"/>
+          <w:sz w:val="20"/>
+        </w:rPr>
+        <w:t>Рисунок 40 — Прослушиваемые порты (lsof)</w:t>
+      </w:r>
+    </w:p>
+    <w:p>
+      <w:pPr>
+        <w:jc w:val="center"/>
+      </w:pPr>
+      <w:r>
+        <w:drawing>
+          <wp:inline>
+            <wp:extent cx="5400000" cy="860111"/>
+            <wp:docPr id="41" name="Picture 41"/>
+            <wp:cNvGraphicFramePr>
+              <a:graphicFrameLocks noChangeAspect="1"/>
+            </wp:cNvGraphicFramePr>
+            <a:graphic>
+              <a:graphicData uri="http://schemas.openxmlformats.org/drawingml/2006/picture">
+                <pic:pic>
+                  <pic:nvPicPr>
+                    <pic:cNvPr id="0" name="p7_ss.png"/>
+                    <pic:cNvPicPr/>
+                  </pic:nvPicPr>
+                  <pic:blipFill>
+                    <a:blip r:embed="rId48"/>
+                    <a:stretch>
+                      <a:fillRect/>
+                    </a:stretch>
+                  </pic:blipFill>
+                  <pic:spPr>
+                    <a:xfrm>
+                      <a:off x="0" y="0"/>
+                      <a:ext cx="5400000" cy="860111"/>
+                    </a:xfrm>
+                    <a:prstGeom prst="rect"/>
+                  </pic:spPr>
+                </pic:pic>
+              </a:graphicData>
+            </a:graphic>
+          </wp:inline>
+        </w:drawing>
+      </w:r>
+    </w:p>
+    <w:p>
+      <w:pPr>
+        <w:jc w:val="center"/>
+      </w:pPr>
+      <w:r>
+        <w:rPr>
+          <w:rFonts w:ascii="Times New Roman" w:hAnsi="Times New Roman" w:eastAsia="Times New Roman"/>
+          <w:b w:val="0"/>
+          <w:sz w:val="20"/>
+        </w:rPr>
+        <w:t>Рисунок 41 — Установленные соединения (ss)</w:t>
+      </w:r>
+    </w:p>
+    <w:p>
+      <w:pPr>
+        <w:jc w:val="center"/>
+      </w:pPr>
+      <w:r>
+        <w:drawing>
+          <wp:inline>
+            <wp:extent cx="5400000" cy="1112359"/>
+            <wp:docPr id="42" name="Picture 42"/>
+            <wp:cNvGraphicFramePr>
+              <a:graphicFrameLocks noChangeAspect="1"/>
+            </wp:cNvGraphicFramePr>
+            <a:graphic>
+              <a:graphicData uri="http://schemas.openxmlformats.org/drawingml/2006/picture">
+                <pic:pic>
+                  <pic:nvPicPr>
+                    <pic:cNvPr id="0" name="p7_script.png"/>
+                    <pic:cNvPicPr/>
+                  </pic:nvPicPr>
+                  <pic:blipFill>
+                    <a:blip r:embed="rId49"/>
+                    <a:stretch>
+                      <a:fillRect/>
+                    </a:stretch>
+                  </pic:blipFill>
+                  <pic:spPr>
+                    <a:xfrm>
+                      <a:off x="0" y="0"/>
+                      <a:ext cx="5400000" cy="1112359"/>
+                    </a:xfrm>
+                    <a:prstGeom prst="rect"/>
+                  </pic:spPr>
+                </pic:pic>
+              </a:graphicData>
+            </a:graphic>
+          </wp:inline>
+        </w:drawing>
+      </w:r>
+    </w:p>
+    <w:p>
+      <w:pPr>
+        <w:jc w:val="center"/>
+      </w:pPr>
+      <w:r>
+        <w:rPr>
+          <w:rFonts w:ascii="Times New Roman" w:hAnsi="Times New Roman" w:eastAsia="Times New Roman"/>
+          <w:b w:val="0"/>
+          <w:sz w:val="20"/>
+        </w:rPr>
+        <w:t>Рисунок 42 — Скрипт conn.sh и его вывод</w:t>
+      </w:r>
+    </w:p>
+    <w:p>
+      <w:pPr>
+        <w:jc w:val="center"/>
+      </w:pPr>
+      <w:r>
+        <w:drawing>
+          <wp:inline>
+            <wp:extent cx="5400000" cy="808989"/>
+            <wp:docPr id="43" name="Picture 43"/>
+            <wp:cNvGraphicFramePr>
+              <a:graphicFrameLocks noChangeAspect="1"/>
+            </wp:cNvGraphicFramePr>
+            <a:graphic>
+              <a:graphicData uri="http://schemas.openxmlformats.org/drawingml/2006/picture">
+                <pic:pic>
+                  <pic:nvPicPr>
+                    <pic:cNvPr id="0" name="p7_nethogs.png"/>
+                    <pic:cNvPicPr/>
+                  </pic:nvPicPr>
+                  <pic:blipFill>
+                    <a:blip r:embed="rId50"/>
+                    <a:stretch>
+                      <a:fillRect/>
+                    </a:stretch>
+                  </pic:blipFill>
+                  <pic:spPr>
+                    <a:xfrm>
+                      <a:off x="0" y="0"/>
+                      <a:ext cx="5400000" cy="808989"/>
+                    </a:xfrm>
+                    <a:prstGeom prst="rect"/>
+                  </pic:spPr>
+                </pic:pic>
+              </a:graphicData>
+            </a:graphic>
+          </wp:inline>
+        </w:drawing>
+      </w:r>
+    </w:p>
+    <w:p>
+      <w:pPr>
+        <w:jc w:val="center"/>
+      </w:pPr>
+      <w:r>
+        <w:rPr>
+          <w:rFonts w:ascii="Times New Roman" w:hAnsi="Times New Roman" w:eastAsia="Times New Roman"/>
+          <w:b w:val="0"/>
+          <w:sz w:val="20"/>
+        </w:rPr>
+        <w:t>Рисунок 43 — nethogs: sshd, PID 1270, enp0s3, 2,427 КБ/с (передача), 0,258 КБ/с (приём)</w:t>
+      </w:r>
+    </w:p>
+    <w:p>
+      <w:pPr>
         <w:pStyle w:val="Heading1"/>
       </w:pPr>
       <w:r>
@@ -3591,6 +4034,26 @@
           <w:sz w:val="22"/>
         </w:rPr>
         <w:t>Загрузка растёт и выходит на насыщение: от 382 КиБ/с при 100 байтах до 7,43 МиБ/с при 10100 и далее медленно до 9,6 МиБ/с при 50100–60100 байтах (рост между 10100 и 60100 всего около 30 %). Число пакетов в секунду тоже растёт (с 2,75 до 6,7 тысяч), потому что большие ICMP-сообщения не помещаются в MTU 1500 и разбиваются на IP-фрагменты, а bmon считает фрагменты как отдельные пакеты; поэтому один запрос размером 60100 байт даёт около 41 фрагмента. Ping -f отправляет следующий запрос сразу после ответа, поэтому скорость ограничена пропускной способностью виртуального канала и производительностью обработки в виртуальных машинах: при увеличении размера нагрузка не растёт пропорционально, а выходит на предел около 9,6 МиБ/с.</w:t>
+      </w:r>
+    </w:p>
+    <w:p>
+      <w:r>
+        <w:rPr>
+          <w:rFonts w:ascii="Times New Roman" w:hAnsi="Times New Roman" w:eastAsia="Times New Roman"/>
+          <w:b/>
+          <w:sz w:val="22"/>
+        </w:rPr>
+        <w:t>11. Какие выводы вы сделали в Части 7, п.4?</w:t>
+      </w:r>
+    </w:p>
+    <w:p>
+      <w:r>
+        <w:rPr>
+          <w:rFonts w:ascii="Times New Roman" w:hAnsi="Times New Roman" w:eastAsia="Times New Roman"/>
+          <w:b w:val="0"/>
+          <w:sz w:val="22"/>
+        </w:rPr>
+        <w:t>Список клиентов и число соединений с ними можно получить из таблицы сокетов ядра командой ss в состоянии established, отфильтровав локальный порт и сгруппировав по адресу удалённой стороны (awk выбирает столбец с адресом, sed отбрасывает порт клиента, sort | uniq -c считает, sort -rn упорядочивает). Скрипт показал 4 соединения с адреса 10.0.2.4 на порт 22 — по одному на каждый запущенный клиент ssh, что подтверждает: каждое SSH-соединение — отдельный TCP-сокет с собственным клиентским портом. Скрипт учитывает только установленные соединения и IPv4-адреса; по числу соединений с одного адреса можно выявить перебор паролей или перегрузку сервера.</w:t>
       </w:r>
     </w:p>
     <w:p>

</xml_diff>

<commit_message>
Lab 3: Part 8, conclusion, final report
Co-Authored-By: Claude Sonnet 5.5 <noreply@anthropic.com>
Claude-Session: https://claude.ai/code/session_01AxRBWGkpGe1tM1Y5SaPo4g
</commit_message>
<xml_diff>
--- a/lab3/lab-3_report.docx
+++ b/lab3/lab-3_report.docx
@@ -635,6 +635,57 @@
           <w:sz w:val="22"/>
         </w:rPr>
         <w:t>4. Закрыл соединения (pkill sshpass), подключился с c7-2 одним соединением и запустил в нём top. На c7-1 запустил nethogs -d 1 enp0s3 и определил среднюю скорость передачи sshd (2,427 КБ/с отправка, 0,258 КБ/с приём) и PID сеансового процесса sshd (1270; PID процесса sshd, принимающего соединения на порту 22, — 486).</w:t>
+      </w:r>
+    </w:p>
+    <w:p/>
+    <w:p>
+      <w:r>
+        <w:rPr>
+          <w:rFonts w:ascii="Times New Roman" w:hAnsi="Times New Roman" w:eastAsia="Times New Roman"/>
+          <w:b/>
+          <w:sz w:val="24"/>
+        </w:rPr>
+        <w:t>Часть 8. Работа с утилитой nc (NetCat)</w:t>
+      </w:r>
+    </w:p>
+    <w:p>
+      <w:r>
+        <w:rPr>
+          <w:rFonts w:ascii="Times New Roman" w:hAnsi="Times New Roman" w:eastAsia="Times New Roman"/>
+          <w:b w:val="0"/>
+          <w:sz w:val="22"/>
+        </w:rPr>
+        <w:t>1. На c7-1 запустил tcpdump на интерфейсе enp0s3 в фоне для портов 9999 и 4444 с выводом содержимого пакетов (ключ -A) в файл d.txt.</w:t>
+      </w:r>
+    </w:p>
+    <w:p>
+      <w:r>
+        <w:rPr>
+          <w:rFonts w:ascii="Times New Roman" w:hAnsi="Times New Roman" w:eastAsia="Times New Roman"/>
+          <w:b w:val="0"/>
+          <w:sz w:val="22"/>
+        </w:rPr>
+        <w:t>2. Передал текстовый файл (26 слов) с c7-2 на c7-1 по TCP-порту 9999: на c7-1 nc -l 9999 &gt; r.txt, на c7-2 nc -N 10.0.2.16 9999 &lt; msg.txt. Файл на c7-1 получен без искажений.</w:t>
+      </w:r>
+    </w:p>
+    <w:p>
+      <w:r>
+        <w:rPr>
+          <w:rFonts w:ascii="Times New Roman" w:hAnsi="Times New Roman" w:eastAsia="Times New Roman"/>
+          <w:b w:val="0"/>
+          <w:sz w:val="22"/>
+        </w:rPr>
+        <w:t>3. Организовал текстовый чат по UDP-порту 4444: на c7-1 nc -u -l 4444, на c7-2 nc -u 10.0.2.16 4444. Обменялся сообщениями hi, fine, ok, завершил сессию Ctrl+C.</w:t>
+      </w:r>
+    </w:p>
+    <w:p>
+      <w:r>
+        <w:rPr>
+          <w:rFonts w:ascii="Times New Roman" w:hAnsi="Times New Roman" w:eastAsia="Times New Roman"/>
+          <w:b w:val="0"/>
+          <w:sz w:val="22"/>
+        </w:rPr>
+        <w:t>4. Остановил tcpdump и просмотрел d.txt: в нём в открытом виде присутствуют и содержимое переданного файла, и сообщения чата. Вывод: nc передаёт данные без шифрования и аутентификации, поэтому любой узел, видящий трафик (в моей сети — перехватчик с неразборчивым режимом на сетевой карте), может прочитать содержимое; для защиты нужно использовать шифрованные протоколы (TLS, SSH). Различие TCP и UDP видно по заголовкам: у TCP есть установка соединения и подтверждения (Flags), у UDP датаграммы идут без них. Пункт 5 (reverse shell) не выполнялся, так как он по желанию.</w:t>
       </w:r>
     </w:p>
     <w:p/>
@@ -3830,6 +3881,284 @@
     </w:p>
     <w:p>
       <w:pPr>
+        <w:pStyle w:val="Heading2"/>
+      </w:pPr>
+      <w:r>
+        <w:t>Артефакт 12. nc и tcpdump (Часть 8, п. 1–4)</w:t>
+      </w:r>
+    </w:p>
+    <w:p>
+      <w:r>
+        <w:rPr>
+          <w:rFonts w:ascii="Times New Roman" w:hAnsi="Times New Roman" w:eastAsia="Times New Roman"/>
+          <w:b w:val="0"/>
+          <w:sz w:val="22"/>
+        </w:rPr>
+        <w:t>c7-1: tcpdump в фоне, приём файла на TCP 9999, чат на UDP 4444. Скриншоты: приём файла, чат (слева c7-1, справа c7-2), перехваченное содержимое в d.txt.</w:t>
+      </w:r>
+    </w:p>
+    <w:p>
+      <w:pPr>
+        <w:spacing w:after="0"/>
+      </w:pPr>
+      <w:r>
+        <w:rPr>
+          <w:rFonts w:ascii="Courier New" w:hAnsi="Courier New" w:eastAsia="Courier New"/>
+          <w:b w:val="0"/>
+          <w:sz w:val="17"/>
+        </w:rPr>
+        <w:t>c7-1: tcpdump -nn -l -i enp0s3 -A port 9999 or port 4444 &gt; d.txt 2&gt;&amp;1 &amp;</w:t>
+      </w:r>
+    </w:p>
+    <w:p>
+      <w:pPr>
+        <w:spacing w:after="0"/>
+      </w:pPr>
+      <w:r>
+        <w:rPr>
+          <w:rFonts w:ascii="Courier New" w:hAnsi="Courier New" w:eastAsia="Courier New"/>
+          <w:b w:val="0"/>
+          <w:sz w:val="17"/>
+        </w:rPr>
+        <w:t>c7-1: nc -l 9999 &gt; r.txt</w:t>
+      </w:r>
+    </w:p>
+    <w:p>
+      <w:pPr>
+        <w:spacing w:after="0"/>
+      </w:pPr>
+      <w:r>
+        <w:rPr>
+          <w:rFonts w:ascii="Courier New" w:hAnsi="Courier New" w:eastAsia="Courier New"/>
+          <w:b w:val="0"/>
+          <w:sz w:val="17"/>
+        </w:rPr>
+        <w:t>c7-2: nc -N 10.0.2.16 9999 &lt; msg.txt</w:t>
+      </w:r>
+    </w:p>
+    <w:p>
+      <w:pPr>
+        <w:spacing w:after="0"/>
+      </w:pPr>
+      <w:r>
+        <w:rPr>
+          <w:rFonts w:ascii="Courier New" w:hAnsi="Courier New" w:eastAsia="Courier New"/>
+          <w:b w:val="0"/>
+          <w:sz w:val="17"/>
+        </w:rPr>
+        <w:t>c7-1: cat r.txt</w:t>
+      </w:r>
+    </w:p>
+    <w:p>
+      <w:pPr>
+        <w:spacing w:after="0"/>
+      </w:pPr>
+      <w:r>
+        <w:rPr>
+          <w:rFonts w:ascii="Courier New" w:hAnsi="Courier New" w:eastAsia="Courier New"/>
+          <w:b w:val="0"/>
+          <w:sz w:val="17"/>
+        </w:rPr>
+        <w:t>c7-1: nc -u -l 4444</w:t>
+      </w:r>
+    </w:p>
+    <w:p>
+      <w:pPr>
+        <w:spacing w:after="0"/>
+      </w:pPr>
+      <w:r>
+        <w:rPr>
+          <w:rFonts w:ascii="Courier New" w:hAnsi="Courier New" w:eastAsia="Courier New"/>
+          <w:b w:val="0"/>
+          <w:sz w:val="17"/>
+        </w:rPr>
+        <w:t>c7-2: nc -u 10.0.2.16 4444</w:t>
+      </w:r>
+    </w:p>
+    <w:p>
+      <w:pPr>
+        <w:spacing w:after="0"/>
+      </w:pPr>
+      <w:r>
+        <w:rPr>
+          <w:rFonts w:ascii="Courier New" w:hAnsi="Courier New" w:eastAsia="Courier New"/>
+          <w:b w:val="0"/>
+          <w:sz w:val="17"/>
+        </w:rPr>
+        <w:t>c7-1: pkill tcpdump</w:t>
+      </w:r>
+    </w:p>
+    <w:p>
+      <w:pPr>
+        <w:spacing w:after="0"/>
+      </w:pPr>
+      <w:r>
+        <w:rPr>
+          <w:rFonts w:ascii="Courier New" w:hAnsi="Courier New" w:eastAsia="Courier New"/>
+          <w:b w:val="0"/>
+          <w:sz w:val="17"/>
+        </w:rPr>
+        <w:t>c7-1: grep -a -E "p p p|hi|fine|ok" d.txt | head</w:t>
+      </w:r>
+    </w:p>
+    <w:p>
+      <w:pPr>
+        <w:jc w:val="center"/>
+      </w:pPr>
+      <w:r>
+        <w:drawing>
+          <wp:inline>
+            <wp:extent cx="5400000" cy="2696629"/>
+            <wp:docPr id="44" name="Picture 44"/>
+            <wp:cNvGraphicFramePr>
+              <a:graphicFrameLocks noChangeAspect="1"/>
+            </wp:cNvGraphicFramePr>
+            <a:graphic>
+              <a:graphicData uri="http://schemas.openxmlformats.org/drawingml/2006/picture">
+                <pic:pic>
+                  <pic:nvPicPr>
+                    <pic:cNvPr id="0" name="p8_file.png"/>
+                    <pic:cNvPicPr/>
+                  </pic:nvPicPr>
+                  <pic:blipFill>
+                    <a:blip r:embed="rId51"/>
+                    <a:stretch>
+                      <a:fillRect/>
+                    </a:stretch>
+                  </pic:blipFill>
+                  <pic:spPr>
+                    <a:xfrm>
+                      <a:off x="0" y="0"/>
+                      <a:ext cx="5400000" cy="2696629"/>
+                    </a:xfrm>
+                    <a:prstGeom prst="rect"/>
+                  </pic:spPr>
+                </pic:pic>
+              </a:graphicData>
+            </a:graphic>
+          </wp:inline>
+        </w:drawing>
+      </w:r>
+    </w:p>
+    <w:p>
+      <w:pPr>
+        <w:jc w:val="center"/>
+      </w:pPr>
+      <w:r>
+        <w:rPr>
+          <w:rFonts w:ascii="Times New Roman" w:hAnsi="Times New Roman" w:eastAsia="Times New Roman"/>
+          <w:b w:val="0"/>
+          <w:sz w:val="20"/>
+        </w:rPr>
+        <w:t>Рисунок 44 — Запуск tcpdump и приём файла по TCP 9999</w:t>
+      </w:r>
+    </w:p>
+    <w:p>
+      <w:pPr>
+        <w:jc w:val="center"/>
+      </w:pPr>
+      <w:r>
+        <w:drawing>
+          <wp:inline>
+            <wp:extent cx="5400000" cy="1235915"/>
+            <wp:docPr id="45" name="Picture 45"/>
+            <wp:cNvGraphicFramePr>
+              <a:graphicFrameLocks noChangeAspect="1"/>
+            </wp:cNvGraphicFramePr>
+            <a:graphic>
+              <a:graphicData uri="http://schemas.openxmlformats.org/drawingml/2006/picture">
+                <pic:pic>
+                  <pic:nvPicPr>
+                    <pic:cNvPr id="0" name="p8_chat.png"/>
+                    <pic:cNvPicPr/>
+                  </pic:nvPicPr>
+                  <pic:blipFill>
+                    <a:blip r:embed="rId52"/>
+                    <a:stretch>
+                      <a:fillRect/>
+                    </a:stretch>
+                  </pic:blipFill>
+                  <pic:spPr>
+                    <a:xfrm>
+                      <a:off x="0" y="0"/>
+                      <a:ext cx="5400000" cy="1235915"/>
+                    </a:xfrm>
+                    <a:prstGeom prst="rect"/>
+                  </pic:spPr>
+                </pic:pic>
+              </a:graphicData>
+            </a:graphic>
+          </wp:inline>
+        </w:drawing>
+      </w:r>
+    </w:p>
+    <w:p>
+      <w:pPr>
+        <w:jc w:val="center"/>
+      </w:pPr>
+      <w:r>
+        <w:rPr>
+          <w:rFonts w:ascii="Times New Roman" w:hAnsi="Times New Roman" w:eastAsia="Times New Roman"/>
+          <w:b w:val="0"/>
+          <w:sz w:val="20"/>
+        </w:rPr>
+        <w:t>Рисунок 45 — Чат по UDP 4444 (c7-1 и c7-2)</w:t>
+      </w:r>
+    </w:p>
+    <w:p>
+      <w:pPr>
+        <w:jc w:val="center"/>
+      </w:pPr>
+      <w:r>
+        <w:drawing>
+          <wp:inline>
+            <wp:extent cx="5400000" cy="1078652"/>
+            <wp:docPr id="46" name="Picture 46"/>
+            <wp:cNvGraphicFramePr>
+              <a:graphicFrameLocks noChangeAspect="1"/>
+            </wp:cNvGraphicFramePr>
+            <a:graphic>
+              <a:graphicData uri="http://schemas.openxmlformats.org/drawingml/2006/picture">
+                <pic:pic>
+                  <pic:nvPicPr>
+                    <pic:cNvPr id="0" name="p8_grep.png"/>
+                    <pic:cNvPicPr/>
+                  </pic:nvPicPr>
+                  <pic:blipFill>
+                    <a:blip r:embed="rId53"/>
+                    <a:stretch>
+                      <a:fillRect/>
+                    </a:stretch>
+                  </pic:blipFill>
+                  <pic:spPr>
+                    <a:xfrm>
+                      <a:off x="0" y="0"/>
+                      <a:ext cx="5400000" cy="1078652"/>
+                    </a:xfrm>
+                    <a:prstGeom prst="rect"/>
+                  </pic:spPr>
+                </pic:pic>
+              </a:graphicData>
+            </a:graphic>
+          </wp:inline>
+        </w:drawing>
+      </w:r>
+    </w:p>
+    <w:p>
+      <w:pPr>
+        <w:jc w:val="center"/>
+      </w:pPr>
+      <w:r>
+        <w:rPr>
+          <w:rFonts w:ascii="Times New Roman" w:hAnsi="Times New Roman" w:eastAsia="Times New Roman"/>
+          <w:b w:val="0"/>
+          <w:sz w:val="20"/>
+        </w:rPr>
+        <w:t>Рисунок 46 — Перехваченное tcpdump содержимое: текст файла и сообщения чата</w:t>
+      </w:r>
+    </w:p>
+    <w:p>
+      <w:pPr>
         <w:pStyle w:val="Heading1"/>
       </w:pPr>
       <w:r>
@@ -4074,6 +4403,24 @@
           <w:sz w:val="22"/>
         </w:rPr>
         <w:t>На канальном (втором) уровне. vnstat не перехватывает пакеты, а периодически считывает счётчики сетевого интерфейса, которые ведёт ядро (/proc/net/dev, /sys/class/net/&lt;интерфейс&gt;/statistics): число принятых и переданных байт и кадров интерфейса. Эти счётчики включают заголовки Ethernet, что видно по результату: 500 ICMP-пакетов по 84 байта дали около 98 байт на кадр (56 данных + 8 ICMP + 20 IP + 14 Ethernet), всего ≈ 48 КиБ.</w:t>
+      </w:r>
+    </w:p>
+    <w:p>
+      <w:pPr>
+        <w:pStyle w:val="Heading1"/>
+      </w:pPr>
+      <w:r>
+        <w:t>Вывод</w:t>
+      </w:r>
+    </w:p>
+    <w:p>
+      <w:r>
+        <w:rPr>
+          <w:rFonts w:ascii="Times New Roman" w:hAnsi="Times New Roman" w:eastAsia="Times New Roman"/>
+          <w:b w:val="0"/>
+          <w:sz w:val="22"/>
+        </w:rPr>
+        <w:t>В ходе работы настроил стенд из двух виртуальных машин в сети NAT и научился пользоваться утилитами диагностики и мониторинга: ping, mtr и traceroute для проверки соединения и маршрута (в сети NAT VirtualBox маршрут за шлюзом скрыт), bmon и vnstat для оценки загрузки интерфейса, lsof, ss и nethogs для анализа сетевых соединений приложений, nc и tcpdump для передачи данных и перехвата трафика. В Wireshark определил самые активные узел и порт (HTTPS, порт 443), построил графики TCP и UDP, написал фильтры DNS, Ethernet и широковещательных кадров и по MAC-адресам определил, что хост подключён к маршрутизатору (точке доступа). Убедился, что данные, передаваемые без шифрования, читаются при перехвате.</w:t>
       </w:r>
     </w:p>
     <w:sectPr>

</xml_diff>